<commit_message>
docs: update AGENTS.md for improved project structure clarity; enhance testing guidelines and add sample document for development use
</commit_message>
<xml_diff>
--- a/test/out.docx
+++ b/test/out.docx
@@ -4,6 +4,44 @@
   <w:body>
     <w:p>
       <w:pPr>
+        <w:spacing w:before="240" w:after="240"/>
+        <w:jc w:val="center"/>
+      </w:pPr>
+      <w:r>
+        <w:rPr>
+          <w:rFonts w:ascii="SimSun" w:hAnsi="SimSun" w:eastAsia="SimSun"/>
+          <w:b/>
+          <w:sz w:val="32"/>
+        </w:rPr>
+        <w:t>目录</w:t>
+      </w:r>
+    </w:p>
+    <w:p>
+      <w:r>
+        <w:fldChar w:fldCharType="begin"/>
+        <w:instrText xml:space="preserve"> TOC \o "1-3" \h \z \u </w:instrText>
+        <w:fldChar w:fldCharType="separate"/>
+      </w:r>
+      <w:r>
+        <w:rPr>
+          <w:i/>
+          <w:color w:val="808080"/>
+          <w:sz w:val="20"/>
+        </w:rPr>
+        <w:t>右键点击并选择"更新域"，或按 Ctrl+A 然后 F9</w:t>
+      </w:r>
+      <w:r>
+        <w:fldChar w:fldCharType="end"/>
+      </w:r>
+    </w:p>
+    <w:p>
+      <w:r>
+        <w:br w:type="page"/>
+      </w:r>
+    </w:p>
+    <w:p>
+      <w:pPr>
+        <w:pStyle w:val="Heading1"/>
         <w:spacing w:line="288" w:lineRule="auto" w:before="240" w:after="120"/>
         <w:ind w:firstLine="0"/>
         <w:jc w:val="left"/>
@@ -13,16 +51,15 @@
           <w:rFonts w:ascii="SimSun" w:hAnsi="SimSun" w:eastAsia="SimSun"/>
           <w:b/>
           <w:i w:val="0"/>
-          <w:color w:val="1F2937"/>
+          <w:color w:val="000000"/>
           <w:sz w:val="48"/>
         </w:rPr>
         <w:t>标题一：中文输出验证</w:t>
       </w:r>
     </w:p>
-    <w:p/>
     <w:p>
       <w:pPr>
-        <w:spacing w:line="384" w:lineRule="auto" w:before="0" w:after="160"/>
+        <w:spacing w:line="360" w:lineRule="auto" w:before="0" w:after="160"/>
         <w:ind w:firstLine="480"/>
         <w:jc w:val="left"/>
       </w:pPr>
@@ -34,32 +71,96 @@
           <w:color w:val="000000"/>
           <w:sz w:val="24"/>
         </w:rPr>
-        <w:t>这是正文段落，包含中文内容与简单格式。这里是加粗与*斜体*的演示。</w:t>
+        <w:t>这是正文段落，包含中文内容与简单格式。这里是</w:t>
+      </w:r>
+      <w:r>
+        <w:rPr>
+          <w:rFonts w:ascii="SimSun" w:hAnsi="SimSun" w:eastAsia="SimSun"/>
+          <w:b/>
+          <w:i w:val="0"/>
+          <w:color w:val="000000"/>
+          <w:sz w:val="24"/>
+        </w:rPr>
+        <w:t>加粗</w:t>
+      </w:r>
+      <w:r>
+        <w:rPr>
+          <w:rFonts w:ascii="SimSun" w:hAnsi="SimSun" w:eastAsia="SimSun"/>
+          <w:b w:val="0"/>
+          <w:i w:val="0"/>
+          <w:color w:val="000000"/>
+          <w:sz w:val="24"/>
+        </w:rPr>
+        <w:t>与</w:t>
+      </w:r>
+      <w:r>
+        <w:rPr>
+          <w:rFonts w:ascii="SimSun" w:hAnsi="SimSun" w:eastAsia="SimSun"/>
+          <w:b w:val="0"/>
+          <w:i/>
+          <w:color w:val="000000"/>
+          <w:sz w:val="24"/>
+        </w:rPr>
+        <w:t>斜体</w:t>
+      </w:r>
+      <w:r>
+        <w:rPr>
+          <w:rFonts w:ascii="SimSun" w:hAnsi="SimSun" w:eastAsia="SimSun"/>
+          <w:b w:val="0"/>
+          <w:i w:val="0"/>
+          <w:color w:val="000000"/>
+          <w:sz w:val="24"/>
+        </w:rPr>
+        <w:t>的演示。</w:t>
       </w:r>
     </w:p>
-    <w:p/>
     <w:p>
       <w:pPr>
         <w:spacing w:line="336" w:lineRule="auto" w:before="160" w:after="160"/>
         <w:ind w:firstLine="0" w:left="360"/>
         <w:jc w:val="left"/>
+        <w:shd w:val="clear" w:color="auto" w:fill="F5F7F9"/>
       </w:pPr>
       <w:r>
         <w:rPr>
           <w:rFonts w:ascii="SimSun" w:hAnsi="SimSun" w:eastAsia="SimSun"/>
           <w:b w:val="0"/>
           <w:i/>
-          <w:color w:val="4B5563"/>
+          <w:color w:val="000000"/>
           <w:sz w:val="24"/>
         </w:rPr>
         <w:t>这是一段引用文本，用于验证缩进与中文字体。</w:t>
       </w:r>
     </w:p>
-    <w:p/>
     <w:p>
       <w:pPr>
-        <w:pStyle w:val="ListBullet"/>
-        <w:spacing w:line="384" w:lineRule="auto" w:before="0" w:after="160"/>
+        <w:spacing w:before="120" w:after="120"/>
+        <w:pBdr>
+          <w:bottom w:val="single" w:sz="6" w:space="1" w:color="CCCCCC"/>
+        </w:pBdr>
+      </w:pPr>
+    </w:p>
+    <w:p>
+      <w:pPr>
+        <w:pStyle w:val="Heading2"/>
+        <w:spacing w:line="288" w:lineRule="auto" w:before="240" w:after="120"/>
+        <w:ind w:firstLine="0"/>
+        <w:jc w:val="left"/>
+      </w:pPr>
+      <w:r>
+        <w:rPr>
+          <w:rFonts w:ascii="SimSun" w:hAnsi="SimSun" w:eastAsia="SimSun"/>
+          <w:b/>
+          <w:i w:val="0"/>
+          <w:color w:val="000000"/>
+          <w:sz w:val="40"/>
+        </w:rPr>
+        <w:t>标题二：内联格式测试</w:t>
+      </w:r>
+    </w:p>
+    <w:p>
+      <w:pPr>
+        <w:spacing w:line="360" w:lineRule="auto" w:before="0" w:after="160"/>
         <w:ind w:firstLine="480"/>
         <w:jc w:val="left"/>
       </w:pPr>
@@ -71,13 +172,135 @@
           <w:color w:val="000000"/>
           <w:sz w:val="24"/>
         </w:rPr>
-        <w:t>列表项一（无序）</w:t>
+        <w:t>这是一段包含多种内联格式的文本：</w:t>
+      </w:r>
+      <w:r>
+        <w:rPr>
+          <w:rFonts w:ascii="SimSun" w:hAnsi="SimSun" w:eastAsia="SimSun"/>
+          <w:b/>
+          <w:i w:val="0"/>
+          <w:color w:val="000000"/>
+          <w:sz w:val="24"/>
+        </w:rPr>
+        <w:t>粗体</w:t>
+      </w:r>
+      <w:r>
+        <w:rPr>
+          <w:rFonts w:ascii="SimSun" w:hAnsi="SimSun" w:eastAsia="SimSun"/>
+          <w:b w:val="0"/>
+          <w:i w:val="0"/>
+          <w:color w:val="000000"/>
+          <w:sz w:val="24"/>
+        </w:rPr>
+        <w:t>、</w:t>
+      </w:r>
+      <w:r>
+        <w:rPr>
+          <w:rFonts w:ascii="SimSun" w:hAnsi="SimSun" w:eastAsia="SimSun"/>
+          <w:b w:val="0"/>
+          <w:i/>
+          <w:color w:val="000000"/>
+          <w:sz w:val="24"/>
+        </w:rPr>
+        <w:t>斜体</w:t>
+      </w:r>
+      <w:r>
+        <w:rPr>
+          <w:rFonts w:ascii="SimSun" w:hAnsi="SimSun" w:eastAsia="SimSun"/>
+          <w:b w:val="0"/>
+          <w:i w:val="0"/>
+          <w:color w:val="000000"/>
+          <w:sz w:val="24"/>
+        </w:rPr>
+        <w:t>、</w:t>
+      </w:r>
+      <w:r>
+        <w:rPr>
+          <w:rFonts w:ascii="SimSun" w:hAnsi="SimSun" w:eastAsia="SimSun"/>
+          <w:b/>
+          <w:i/>
+          <w:color w:val="000000"/>
+          <w:sz w:val="24"/>
+        </w:rPr>
+        <w:t>粗斜体</w:t>
+      </w:r>
+      <w:r>
+        <w:rPr>
+          <w:rFonts w:ascii="SimSun" w:hAnsi="SimSun" w:eastAsia="SimSun"/>
+          <w:b w:val="0"/>
+          <w:i w:val="0"/>
+          <w:color w:val="000000"/>
+          <w:sz w:val="24"/>
+        </w:rPr>
+        <w:t>、</w:t>
+      </w:r>
+      <w:r>
+        <w:rPr>
+          <w:rFonts w:ascii="Courier New" w:hAnsi="Courier New" w:eastAsia="SimSun"/>
+          <w:b w:val="0"/>
+          <w:i w:val="0"/>
+          <w:color w:val="000000"/>
+          <w:sz w:val="20"/>
+          <w:shd w:val="clear" w:color="auto" w:fill="F5F7F9"/>
+        </w:rPr>
+        <w:t>行内代码</w:t>
+      </w:r>
+      <w:r>
+        <w:rPr>
+          <w:rFonts w:ascii="SimSun" w:hAnsi="SimSun" w:eastAsia="SimSun"/>
+          <w:b w:val="0"/>
+          <w:i w:val="0"/>
+          <w:color w:val="000000"/>
+          <w:sz w:val="24"/>
+        </w:rPr>
+        <w:t>、</w:t>
+      </w:r>
+      <w:r>
+        <w:rPr>
+          <w:rFonts w:ascii="SimSun" w:hAnsi="SimSun" w:eastAsia="SimSun"/>
+          <w:b w:val="0"/>
+          <w:i w:val="0"/>
+          <w:strike/>
+          <w:color w:val="000000"/>
+          <w:sz w:val="24"/>
+        </w:rPr>
+        <w:t>删除线</w:t>
+      </w:r>
+      <w:r>
+        <w:rPr>
+          <w:rFonts w:ascii="SimSun" w:hAnsi="SimSun" w:eastAsia="SimSun"/>
+          <w:b w:val="0"/>
+          <w:i w:val="0"/>
+          <w:color w:val="000000"/>
+          <w:sz w:val="24"/>
+        </w:rPr>
+        <w:t>、</w:t>
+      </w:r>
+      <w:r>
+        <w:rPr>
+          <w:rFonts w:ascii="SimSun" w:hAnsi="SimSun" w:eastAsia="SimSun"/>
+          <w:b w:val="0"/>
+          <w:i w:val="0"/>
+          <w:color w:val="000000"/>
+          <w:sz w:val="24"/>
+          <w:u w:val="single"/>
+        </w:rPr>
+        <w:t>下划线</w:t>
+      </w:r>
+      <w:r>
+        <w:rPr>
+          <w:rFonts w:ascii="SimSun" w:hAnsi="SimSun" w:eastAsia="SimSun"/>
+          <w:b w:val="0"/>
+          <w:i w:val="0"/>
+          <w:color w:val="000000"/>
+          <w:sz w:val="24"/>
+        </w:rPr>
+        <w:t>。</w:t>
       </w:r>
     </w:p>
     <w:p>
       <w:pPr>
-        <w:pStyle w:val="ListBullet"/>
-        <w:spacing w:line="384" w:lineRule="auto" w:before="0" w:after="160"/>
+        <w:spacing w:line="360" w:lineRule="auto" w:before="0" w:after="160"/>
         <w:ind w:firstLine="480"/>
         <w:jc w:val="left"/>
       </w:pPr>
@@ -89,14 +312,1584 @@
           <w:color w:val="000000"/>
           <w:sz w:val="24"/>
         </w:rPr>
-        <w:t>列表项二（无序）</w:t>
+        <w:t>这是一个</w:t>
+      </w:r>
+      <w:hyperlink r:id="rId9">
+        <w:r>
+          <w:rPr>
+            <w:rFonts w:ascii="SimSun" w:hAnsi="SimSun" w:eastAsia="SimSun"/>
+            <w:b w:val="0"/>
+            <w:i w:val="0"/>
+            <w:color w:val="0000FF"/>
+            <w:sz w:val="24"/>
+            <w:u w:val="single"/>
+          </w:rPr>
+          <w:t>超链接示例</w:t>
+        </w:r>
+      </w:hyperlink>
+      <w:r>
+        <w:rPr>
+          <w:rFonts w:ascii="SimSun" w:hAnsi="SimSun" w:eastAsia="SimSun"/>
+          <w:b w:val="0"/>
+          <w:i w:val="0"/>
+          <w:color w:val="000000"/>
+          <w:sz w:val="24"/>
+        </w:rPr>
+        <w:t>，用于验证链接样式。</w:t>
       </w:r>
     </w:p>
-    <w:p/>
+    <w:p>
+      <w:pPr>
+        <w:pStyle w:val="Heading3"/>
+        <w:spacing w:line="288" w:lineRule="auto" w:before="240" w:after="120"/>
+        <w:ind w:firstLine="0"/>
+        <w:jc w:val="left"/>
+      </w:pPr>
+      <w:r>
+        <w:rPr>
+          <w:rFonts w:ascii="SimSun" w:hAnsi="SimSun" w:eastAsia="SimSun"/>
+          <w:b/>
+          <w:i w:val="0"/>
+          <w:color w:val="000000"/>
+          <w:sz w:val="36"/>
+        </w:rPr>
+        <w:t>标题三：嵌套列表</w:t>
+      </w:r>
+    </w:p>
+    <w:p>
+      <w:pPr>
+        <w:pStyle w:val="Heading4"/>
+        <w:spacing w:line="288" w:lineRule="auto" w:before="240" w:after="120"/>
+        <w:ind w:firstLine="0"/>
+        <w:jc w:val="left"/>
+      </w:pPr>
+      <w:r>
+        <w:rPr>
+          <w:rFonts w:ascii="SimSun" w:hAnsi="SimSun" w:eastAsia="SimSun"/>
+          <w:b/>
+          <w:i w:val="0"/>
+          <w:color w:val="000000"/>
+          <w:sz w:val="48"/>
+        </w:rPr>
+        <w:t>标题四：四级标题</w:t>
+      </w:r>
+    </w:p>
+    <w:p>
+      <w:pPr>
+        <w:pStyle w:val="Heading5"/>
+        <w:spacing w:line="288" w:lineRule="auto" w:before="240" w:after="120"/>
+        <w:ind w:firstLine="0"/>
+        <w:jc w:val="left"/>
+      </w:pPr>
+      <w:r>
+        <w:rPr>
+          <w:rFonts w:ascii="SimSun" w:hAnsi="SimSun" w:eastAsia="SimSun"/>
+          <w:b/>
+          <w:i w:val="0"/>
+          <w:color w:val="000000"/>
+          <w:sz w:val="48"/>
+        </w:rPr>
+        <w:t>标题五：五级标题</w:t>
+      </w:r>
+    </w:p>
+    <w:p>
+      <w:pPr>
+        <w:pStyle w:val="Heading6"/>
+        <w:spacing w:line="288" w:lineRule="auto" w:before="240" w:after="120"/>
+        <w:ind w:firstLine="0"/>
+        <w:jc w:val="left"/>
+      </w:pPr>
+      <w:r>
+        <w:rPr>
+          <w:rFonts w:ascii="SimSun" w:hAnsi="SimSun" w:eastAsia="SimSun"/>
+          <w:b/>
+          <w:i w:val="0"/>
+          <w:color w:val="000000"/>
+          <w:sz w:val="48"/>
+        </w:rPr>
+        <w:t>标题六：六级标题</w:t>
+      </w:r>
+    </w:p>
+    <w:p>
+      <w:pPr>
+        <w:spacing w:before="120" w:after="120"/>
+        <w:pBdr>
+          <w:bottom w:val="single" w:sz="6" w:space="1" w:color="CCCCCC"/>
+        </w:pBdr>
+      </w:pPr>
+    </w:p>
+    <w:p>
+      <w:pPr>
+        <w:pStyle w:val="Heading2"/>
+        <w:spacing w:line="288" w:lineRule="auto" w:before="240" w:after="120"/>
+        <w:ind w:firstLine="0"/>
+        <w:jc w:val="left"/>
+      </w:pPr>
+      <w:r>
+        <w:rPr>
+          <w:rFonts w:ascii="SimSun" w:hAnsi="SimSun" w:eastAsia="SimSun"/>
+          <w:b/>
+          <w:i w:val="0"/>
+          <w:color w:val="000000"/>
+          <w:sz w:val="40"/>
+        </w:rPr>
+        <w:t>无序列表</w:t>
+      </w:r>
+    </w:p>
+    <w:p>
+      <w:pPr>
+        <w:pStyle w:val="ListBullet"/>
+        <w:spacing w:line="360" w:lineRule="auto" w:before="0" w:after="160"/>
+        <w:ind w:firstLine="0"/>
+        <w:jc w:val="left"/>
+      </w:pPr>
+      <w:r>
+        <w:rPr>
+          <w:rFonts w:ascii="SimSun" w:hAnsi="SimSun" w:eastAsia="SimSun"/>
+          <w:b w:val="0"/>
+          <w:i w:val="0"/>
+          <w:color w:val="000000"/>
+          <w:sz w:val="24"/>
+        </w:rPr>
+        <w:t>一级列表项 A</w:t>
+      </w:r>
+    </w:p>
+    <w:p>
+      <w:pPr>
+        <w:pStyle w:val="ListBullet"/>
+        <w:spacing w:line="360" w:lineRule="auto" w:before="0" w:after="160"/>
+        <w:ind w:firstLine="0"/>
+        <w:jc w:val="left"/>
+      </w:pPr>
+      <w:r>
+        <w:rPr>
+          <w:rFonts w:ascii="SimSun" w:hAnsi="SimSun" w:eastAsia="SimSun"/>
+          <w:b w:val="0"/>
+          <w:i w:val="0"/>
+          <w:color w:val="000000"/>
+          <w:sz w:val="24"/>
+        </w:rPr>
+        <w:t>一级列表项 B</w:t>
+      </w:r>
+    </w:p>
+    <w:p>
+      <w:pPr>
+        <w:pStyle w:val="ListBullet"/>
+        <w:spacing w:line="360" w:lineRule="auto" w:before="0" w:after="160"/>
+        <w:ind w:firstLine="0" w:left="720"/>
+        <w:jc w:val="left"/>
+      </w:pPr>
+      <w:r>
+        <w:rPr>
+          <w:rFonts w:ascii="SimSun" w:hAnsi="SimSun" w:eastAsia="SimSun"/>
+          <w:b w:val="0"/>
+          <w:i w:val="0"/>
+          <w:color w:val="000000"/>
+          <w:sz w:val="24"/>
+        </w:rPr>
+        <w:t>二级列表项 B-1</w:t>
+      </w:r>
+    </w:p>
+    <w:p>
+      <w:pPr>
+        <w:pStyle w:val="ListBullet"/>
+        <w:spacing w:line="360" w:lineRule="auto" w:before="0" w:after="160"/>
+        <w:ind w:firstLine="0" w:left="720"/>
+        <w:jc w:val="left"/>
+      </w:pPr>
+      <w:r>
+        <w:rPr>
+          <w:rFonts w:ascii="SimSun" w:hAnsi="SimSun" w:eastAsia="SimSun"/>
+          <w:b w:val="0"/>
+          <w:i w:val="0"/>
+          <w:color w:val="000000"/>
+          <w:sz w:val="24"/>
+        </w:rPr>
+        <w:t>二级列表项 B-2</w:t>
+      </w:r>
+    </w:p>
+    <w:p>
+      <w:pPr>
+        <w:pStyle w:val="ListBullet"/>
+        <w:spacing w:line="360" w:lineRule="auto" w:before="0" w:after="160"/>
+        <w:ind w:firstLine="0" w:left="1440"/>
+        <w:jc w:val="left"/>
+      </w:pPr>
+      <w:r>
+        <w:rPr>
+          <w:rFonts w:ascii="SimSun" w:hAnsi="SimSun" w:eastAsia="SimSun"/>
+          <w:b w:val="0"/>
+          <w:i w:val="0"/>
+          <w:color w:val="000000"/>
+          <w:sz w:val="24"/>
+        </w:rPr>
+        <w:t>三级列表项 B-2-i</w:t>
+      </w:r>
+    </w:p>
+    <w:p>
+      <w:pPr>
+        <w:pStyle w:val="ListBullet"/>
+        <w:spacing w:line="360" w:lineRule="auto" w:before="0" w:after="160"/>
+        <w:ind w:firstLine="0"/>
+        <w:jc w:val="left"/>
+      </w:pPr>
+      <w:r>
+        <w:rPr>
+          <w:rFonts w:ascii="SimSun" w:hAnsi="SimSun" w:eastAsia="SimSun"/>
+          <w:b w:val="0"/>
+          <w:i w:val="0"/>
+          <w:color w:val="000000"/>
+          <w:sz w:val="24"/>
+        </w:rPr>
+        <w:t>一级列表项 C</w:t>
+      </w:r>
+    </w:p>
+    <w:p>
+      <w:pPr>
+        <w:pStyle w:val="Heading2"/>
+        <w:spacing w:line="288" w:lineRule="auto" w:before="240" w:after="120"/>
+        <w:ind w:firstLine="0"/>
+        <w:jc w:val="left"/>
+      </w:pPr>
+      <w:r>
+        <w:rPr>
+          <w:rFonts w:ascii="SimSun" w:hAnsi="SimSun" w:eastAsia="SimSun"/>
+          <w:b/>
+          <w:i w:val="0"/>
+          <w:color w:val="000000"/>
+          <w:sz w:val="40"/>
+        </w:rPr>
+        <w:t>有序列表</w:t>
+      </w:r>
+    </w:p>
     <w:p>
       <w:pPr>
         <w:pStyle w:val="ListNumber"/>
-        <w:spacing w:line="384" w:lineRule="auto" w:before="0" w:after="160"/>
+        <w:spacing w:line="360" w:lineRule="auto" w:before="0" w:after="160"/>
+        <w:ind w:firstLine="0"/>
+        <w:jc w:val="left"/>
+      </w:pPr>
+      <w:r>
+        <w:rPr>
+          <w:rFonts w:ascii="SimSun" w:hAnsi="SimSun" w:eastAsia="SimSun"/>
+          <w:b w:val="0"/>
+          <w:i w:val="0"/>
+          <w:color w:val="000000"/>
+          <w:sz w:val="24"/>
+        </w:rPr>
+        <w:t>第一步：准备材料</w:t>
+      </w:r>
+    </w:p>
+    <w:p>
+      <w:pPr>
+        <w:pStyle w:val="ListNumber"/>
+        <w:spacing w:line="360" w:lineRule="auto" w:before="0" w:after="160"/>
+        <w:ind w:firstLine="0"/>
+        <w:jc w:val="left"/>
+      </w:pPr>
+      <w:r>
+        <w:rPr>
+          <w:rFonts w:ascii="SimSun" w:hAnsi="SimSun" w:eastAsia="SimSun"/>
+          <w:b w:val="0"/>
+          <w:i w:val="0"/>
+          <w:color w:val="000000"/>
+          <w:sz w:val="24"/>
+        </w:rPr>
+        <w:t>第二步：混合搅拌</w:t>
+      </w:r>
+    </w:p>
+    <w:p>
+      <w:pPr>
+        <w:pStyle w:val="ListNumber"/>
+        <w:spacing w:line="360" w:lineRule="auto" w:before="0" w:after="160"/>
+        <w:ind w:firstLine="0" w:left="720"/>
+        <w:jc w:val="left"/>
+      </w:pPr>
+      <w:r>
+        <w:rPr>
+          <w:rFonts w:ascii="SimSun" w:hAnsi="SimSun" w:eastAsia="SimSun"/>
+          <w:b w:val="0"/>
+          <w:i w:val="0"/>
+          <w:color w:val="000000"/>
+          <w:sz w:val="24"/>
+        </w:rPr>
+        <w:t>子步骤 2.1</w:t>
+      </w:r>
+    </w:p>
+    <w:p>
+      <w:pPr>
+        <w:pStyle w:val="ListNumber"/>
+        <w:spacing w:line="360" w:lineRule="auto" w:before="0" w:after="160"/>
+        <w:ind w:firstLine="0" w:left="720"/>
+        <w:jc w:val="left"/>
+      </w:pPr>
+      <w:r>
+        <w:rPr>
+          <w:rFonts w:ascii="SimSun" w:hAnsi="SimSun" w:eastAsia="SimSun"/>
+          <w:b w:val="0"/>
+          <w:i w:val="0"/>
+          <w:color w:val="000000"/>
+          <w:sz w:val="24"/>
+        </w:rPr>
+        <w:t>子步骤 2.2</w:t>
+      </w:r>
+    </w:p>
+    <w:p>
+      <w:pPr>
+        <w:pStyle w:val="ListNumber"/>
+        <w:spacing w:line="360" w:lineRule="auto" w:before="0" w:after="160"/>
+        <w:ind w:firstLine="0"/>
+        <w:jc w:val="left"/>
+      </w:pPr>
+      <w:r>
+        <w:rPr>
+          <w:rFonts w:ascii="SimSun" w:hAnsi="SimSun" w:eastAsia="SimSun"/>
+          <w:b w:val="0"/>
+          <w:i w:val="0"/>
+          <w:color w:val="000000"/>
+          <w:sz w:val="24"/>
+        </w:rPr>
+        <w:t>第三步：烘烤完成</w:t>
+      </w:r>
+    </w:p>
+    <w:p>
+      <w:pPr>
+        <w:pStyle w:val="Heading2"/>
+        <w:spacing w:line="288" w:lineRule="auto" w:before="240" w:after="120"/>
+        <w:ind w:firstLine="0"/>
+        <w:jc w:val="left"/>
+      </w:pPr>
+      <w:r>
+        <w:rPr>
+          <w:rFonts w:ascii="SimSun" w:hAnsi="SimSun" w:eastAsia="SimSun"/>
+          <w:b/>
+          <w:i w:val="0"/>
+          <w:color w:val="000000"/>
+          <w:sz w:val="40"/>
+        </w:rPr>
+        <w:t>混合列表</w:t>
+      </w:r>
+    </w:p>
+    <w:p>
+      <w:pPr>
+        <w:pStyle w:val="ListBullet"/>
+        <w:spacing w:line="360" w:lineRule="auto" w:before="0" w:after="160"/>
+        <w:ind w:firstLine="0"/>
+        <w:jc w:val="left"/>
+      </w:pPr>
+      <w:r>
+        <w:rPr>
+          <w:rFonts w:ascii="SimSun" w:hAnsi="SimSun" w:eastAsia="SimSun"/>
+          <w:b w:val="0"/>
+          <w:i w:val="0"/>
+          <w:color w:val="000000"/>
+          <w:sz w:val="24"/>
+        </w:rPr>
+        <w:t>无序项</w:t>
+      </w:r>
+    </w:p>
+    <w:p>
+      <w:pPr>
+        <w:pStyle w:val="ListNumber"/>
+        <w:spacing w:line="360" w:lineRule="auto" w:before="0" w:after="160"/>
+        <w:ind w:firstLine="0" w:left="720"/>
+        <w:jc w:val="left"/>
+      </w:pPr>
+      <w:r>
+        <w:rPr>
+          <w:rFonts w:ascii="SimSun" w:hAnsi="SimSun" w:eastAsia="SimSun"/>
+          <w:b w:val="0"/>
+          <w:i w:val="0"/>
+          <w:color w:val="000000"/>
+          <w:sz w:val="24"/>
+        </w:rPr>
+        <w:t>嵌套有序项</w:t>
+      </w:r>
+    </w:p>
+    <w:p>
+      <w:pPr>
+        <w:pStyle w:val="ListNumber"/>
+        <w:spacing w:line="360" w:lineRule="auto" w:before="0" w:after="160"/>
+        <w:ind w:firstLine="0" w:left="720"/>
+        <w:jc w:val="left"/>
+      </w:pPr>
+      <w:r>
+        <w:rPr>
+          <w:rFonts w:ascii="SimSun" w:hAnsi="SimSun" w:eastAsia="SimSun"/>
+          <w:b w:val="0"/>
+          <w:i w:val="0"/>
+          <w:color w:val="000000"/>
+          <w:sz w:val="24"/>
+        </w:rPr>
+        <w:t>嵌套有序项</w:t>
+      </w:r>
+    </w:p>
+    <w:p>
+      <w:pPr>
+        <w:pStyle w:val="ListBullet"/>
+        <w:spacing w:line="360" w:lineRule="auto" w:before="0" w:after="160"/>
+        <w:ind w:firstLine="0"/>
+        <w:jc w:val="left"/>
+      </w:pPr>
+      <w:r>
+        <w:rPr>
+          <w:rFonts w:ascii="SimSun" w:hAnsi="SimSun" w:eastAsia="SimSun"/>
+          <w:b w:val="0"/>
+          <w:i w:val="0"/>
+          <w:color w:val="000000"/>
+          <w:sz w:val="24"/>
+        </w:rPr>
+        <w:t>另一个无序项</w:t>
+      </w:r>
+    </w:p>
+    <w:p>
+      <w:pPr>
+        <w:spacing w:before="120" w:after="120"/>
+        <w:pBdr>
+          <w:bottom w:val="single" w:sz="6" w:space="1" w:color="CCCCCC"/>
+        </w:pBdr>
+      </w:pPr>
+    </w:p>
+    <w:p>
+      <w:pPr>
+        <w:pStyle w:val="Heading2"/>
+        <w:spacing w:line="288" w:lineRule="auto" w:before="240" w:after="120"/>
+        <w:ind w:firstLine="0"/>
+        <w:jc w:val="left"/>
+      </w:pPr>
+      <w:r>
+        <w:rPr>
+          <w:rFonts w:ascii="SimSun" w:hAnsi="SimSun" w:eastAsia="SimSun"/>
+          <w:b/>
+          <w:i w:val="0"/>
+          <w:color w:val="000000"/>
+          <w:sz w:val="40"/>
+        </w:rPr>
+        <w:t>表格测试</w:t>
+      </w:r>
+    </w:p>
+    <w:tbl>
+      <w:tblPr>
+        <w:tblW w:type="auto" w:w="0"/>
+        <w:jc w:val="center"/>
+        <w:tblLook w:firstColumn="1" w:firstRow="1" w:lastColumn="0" w:lastRow="0" w:noHBand="0" w:noVBand="1" w:val="04A0"/>
+      </w:tblPr>
+      <w:tblGrid>
+        <w:gridCol w:w="3120"/>
+        <w:gridCol w:w="3120"/>
+        <w:gridCol w:w="3120"/>
+      </w:tblGrid>
+      <w:tr>
+        <w:tc>
+          <w:tcPr>
+            <w:tcW w:type="dxa" w:w="3120"/>
+            <w:tcBorders>
+              <w:top w:val="single" w:sz="4" w:color="000000"/>
+              <w:left w:val="single" w:sz="4" w:color="000000"/>
+              <w:bottom w:val="single" w:sz="4" w:color="000000"/>
+              <w:right w:val="single" w:sz="4" w:color="000000"/>
+            </w:tcBorders>
+            <w:vAlign w:val="center"/>
+            <w:shd w:fill="E5E7EB"/>
+          </w:tcPr>
+          <w:p>
+            <w:pPr>
+              <w:spacing w:line="360" w:lineRule="auto" w:before="0" w:after="160"/>
+              <w:ind w:firstLine="0"/>
+              <w:jc w:val="left"/>
+            </w:pPr>
+            <w:r>
+              <w:rPr>
+                <w:rFonts w:ascii="SimSun" w:hAnsi="SimSun" w:eastAsia="SimSun"/>
+                <w:b/>
+                <w:i w:val="0"/>
+                <w:color w:val="000000"/>
+                <w:sz w:val="24"/>
+              </w:rPr>
+              <w:t>左对齐</w:t>
+            </w:r>
+          </w:p>
+        </w:tc>
+        <w:tc>
+          <w:tcPr>
+            <w:tcW w:type="dxa" w:w="3120"/>
+            <w:tcBorders>
+              <w:top w:val="single" w:sz="4" w:color="000000"/>
+              <w:left w:val="single" w:sz="4" w:color="000000"/>
+              <w:bottom w:val="single" w:sz="4" w:color="000000"/>
+              <w:right w:val="single" w:sz="4" w:color="000000"/>
+            </w:tcBorders>
+            <w:vAlign w:val="center"/>
+            <w:shd w:fill="E5E7EB"/>
+          </w:tcPr>
+          <w:p>
+            <w:pPr>
+              <w:spacing w:line="360" w:lineRule="auto" w:before="0" w:after="160"/>
+              <w:ind w:firstLine="0"/>
+              <w:jc w:val="center"/>
+            </w:pPr>
+            <w:r>
+              <w:rPr>
+                <w:rFonts w:ascii="SimSun" w:hAnsi="SimSun" w:eastAsia="SimSun"/>
+                <w:b/>
+                <w:i w:val="0"/>
+                <w:color w:val="000000"/>
+                <w:sz w:val="24"/>
+              </w:rPr>
+              <w:t>居中对齐</w:t>
+            </w:r>
+          </w:p>
+        </w:tc>
+        <w:tc>
+          <w:tcPr>
+            <w:tcW w:type="dxa" w:w="3120"/>
+            <w:tcBorders>
+              <w:top w:val="single" w:sz="4" w:color="000000"/>
+              <w:left w:val="single" w:sz="4" w:color="000000"/>
+              <w:bottom w:val="single" w:sz="4" w:color="000000"/>
+              <w:right w:val="single" w:sz="4" w:color="000000"/>
+            </w:tcBorders>
+            <w:vAlign w:val="center"/>
+            <w:shd w:fill="E5E7EB"/>
+          </w:tcPr>
+          <w:p>
+            <w:pPr>
+              <w:spacing w:line="360" w:lineRule="auto" w:before="0" w:after="160"/>
+              <w:ind w:firstLine="0"/>
+              <w:jc w:val="right"/>
+            </w:pPr>
+            <w:r>
+              <w:rPr>
+                <w:rFonts w:ascii="SimSun" w:hAnsi="SimSun" w:eastAsia="SimSun"/>
+                <w:b/>
+                <w:i w:val="0"/>
+                <w:color w:val="000000"/>
+                <w:sz w:val="24"/>
+              </w:rPr>
+              <w:t>右对齐</w:t>
+            </w:r>
+          </w:p>
+        </w:tc>
+      </w:tr>
+      <w:tr>
+        <w:tc>
+          <w:tcPr>
+            <w:tcW w:type="dxa" w:w="3120"/>
+            <w:tcBorders>
+              <w:top w:val="single" w:sz="4" w:color="000000"/>
+              <w:left w:val="single" w:sz="4" w:color="000000"/>
+              <w:bottom w:val="single" w:sz="4" w:color="000000"/>
+              <w:right w:val="single" w:sz="4" w:color="000000"/>
+            </w:tcBorders>
+            <w:vAlign w:val="center"/>
+          </w:tcPr>
+          <w:p>
+            <w:pPr>
+              <w:spacing w:line="360" w:lineRule="auto" w:before="0" w:after="160"/>
+              <w:ind w:firstLine="0"/>
+              <w:jc w:val="left"/>
+            </w:pPr>
+            <w:r>
+              <w:rPr>
+                <w:rFonts w:ascii="SimSun" w:hAnsi="SimSun" w:eastAsia="SimSun"/>
+                <w:b w:val="0"/>
+                <w:i w:val="0"/>
+                <w:color w:val="000000"/>
+                <w:sz w:val="24"/>
+              </w:rPr>
+              <w:t>单元格 1</w:t>
+            </w:r>
+          </w:p>
+        </w:tc>
+        <w:tc>
+          <w:tcPr>
+            <w:tcW w:type="dxa" w:w="3120"/>
+            <w:tcBorders>
+              <w:top w:val="single" w:sz="4" w:color="000000"/>
+              <w:left w:val="single" w:sz="4" w:color="000000"/>
+              <w:bottom w:val="single" w:sz="4" w:color="000000"/>
+              <w:right w:val="single" w:sz="4" w:color="000000"/>
+            </w:tcBorders>
+            <w:vAlign w:val="center"/>
+          </w:tcPr>
+          <w:p>
+            <w:pPr>
+              <w:spacing w:line="360" w:lineRule="auto" w:before="0" w:after="160"/>
+              <w:ind w:firstLine="0"/>
+              <w:jc w:val="center"/>
+            </w:pPr>
+            <w:r>
+              <w:rPr>
+                <w:rFonts w:ascii="SimSun" w:hAnsi="SimSun" w:eastAsia="SimSun"/>
+                <w:b w:val="0"/>
+                <w:i w:val="0"/>
+                <w:color w:val="000000"/>
+                <w:sz w:val="24"/>
+              </w:rPr>
+              <w:t>单元格 2</w:t>
+            </w:r>
+          </w:p>
+        </w:tc>
+        <w:tc>
+          <w:tcPr>
+            <w:tcW w:type="dxa" w:w="3120"/>
+            <w:tcBorders>
+              <w:top w:val="single" w:sz="4" w:color="000000"/>
+              <w:left w:val="single" w:sz="4" w:color="000000"/>
+              <w:bottom w:val="single" w:sz="4" w:color="000000"/>
+              <w:right w:val="single" w:sz="4" w:color="000000"/>
+            </w:tcBorders>
+            <w:vAlign w:val="center"/>
+          </w:tcPr>
+          <w:p>
+            <w:pPr>
+              <w:spacing w:line="360" w:lineRule="auto" w:before="0" w:after="160"/>
+              <w:ind w:firstLine="0"/>
+              <w:jc w:val="right"/>
+            </w:pPr>
+            <w:r>
+              <w:rPr>
+                <w:rFonts w:ascii="SimSun" w:hAnsi="SimSun" w:eastAsia="SimSun"/>
+                <w:b w:val="0"/>
+                <w:i w:val="0"/>
+                <w:color w:val="000000"/>
+                <w:sz w:val="24"/>
+              </w:rPr>
+              <w:t>100</w:t>
+            </w:r>
+          </w:p>
+        </w:tc>
+      </w:tr>
+      <w:tr>
+        <w:tc>
+          <w:tcPr>
+            <w:tcW w:type="dxa" w:w="3120"/>
+            <w:tcBorders>
+              <w:top w:val="single" w:sz="4" w:color="000000"/>
+              <w:left w:val="single" w:sz="4" w:color="000000"/>
+              <w:bottom w:val="single" w:sz="4" w:color="000000"/>
+              <w:right w:val="single" w:sz="4" w:color="000000"/>
+            </w:tcBorders>
+            <w:vAlign w:val="center"/>
+          </w:tcPr>
+          <w:p>
+            <w:pPr>
+              <w:spacing w:line="360" w:lineRule="auto" w:before="0" w:after="160"/>
+              <w:ind w:firstLine="0"/>
+              <w:jc w:val="left"/>
+            </w:pPr>
+            <w:r>
+              <w:rPr>
+                <w:rFonts w:ascii="SimSun" w:hAnsi="SimSun" w:eastAsia="SimSun"/>
+                <w:b w:val="0"/>
+                <w:i w:val="0"/>
+                <w:color w:val="000000"/>
+                <w:sz w:val="24"/>
+              </w:rPr>
+              <w:t>A</w:t>
+            </w:r>
+          </w:p>
+        </w:tc>
+        <w:tc>
+          <w:tcPr>
+            <w:tcW w:type="dxa" w:w="3120"/>
+            <w:tcBorders>
+              <w:top w:val="single" w:sz="4" w:color="000000"/>
+              <w:left w:val="single" w:sz="4" w:color="000000"/>
+              <w:bottom w:val="single" w:sz="4" w:color="000000"/>
+              <w:right w:val="single" w:sz="4" w:color="000000"/>
+            </w:tcBorders>
+            <w:vAlign w:val="center"/>
+          </w:tcPr>
+          <w:p>
+            <w:pPr>
+              <w:spacing w:line="360" w:lineRule="auto" w:before="0" w:after="160"/>
+              <w:ind w:firstLine="0"/>
+              <w:jc w:val="center"/>
+            </w:pPr>
+            <w:r>
+              <w:rPr>
+                <w:rFonts w:ascii="SimSun" w:hAnsi="SimSun" w:eastAsia="SimSun"/>
+                <w:b w:val="0"/>
+                <w:i w:val="0"/>
+                <w:color w:val="000000"/>
+                <w:sz w:val="24"/>
+              </w:rPr>
+              <w:t>B</w:t>
+            </w:r>
+          </w:p>
+        </w:tc>
+        <w:tc>
+          <w:tcPr>
+            <w:tcW w:type="dxa" w:w="3120"/>
+            <w:tcBorders>
+              <w:top w:val="single" w:sz="4" w:color="000000"/>
+              <w:left w:val="single" w:sz="4" w:color="000000"/>
+              <w:bottom w:val="single" w:sz="4" w:color="000000"/>
+              <w:right w:val="single" w:sz="4" w:color="000000"/>
+            </w:tcBorders>
+            <w:vAlign w:val="center"/>
+          </w:tcPr>
+          <w:p>
+            <w:pPr>
+              <w:spacing w:line="360" w:lineRule="auto" w:before="0" w:after="160"/>
+              <w:ind w:firstLine="0"/>
+              <w:jc w:val="right"/>
+            </w:pPr>
+            <w:r>
+              <w:rPr>
+                <w:rFonts w:ascii="SimSun" w:hAnsi="SimSun" w:eastAsia="SimSun"/>
+                <w:b w:val="0"/>
+                <w:i w:val="0"/>
+                <w:color w:val="000000"/>
+                <w:sz w:val="24"/>
+              </w:rPr>
+              <w:t>200</w:t>
+            </w:r>
+          </w:p>
+        </w:tc>
+      </w:tr>
+      <w:tr>
+        <w:tc>
+          <w:tcPr>
+            <w:tcW w:type="dxa" w:w="3120"/>
+            <w:tcBorders>
+              <w:top w:val="single" w:sz="4" w:color="000000"/>
+              <w:left w:val="single" w:sz="4" w:color="000000"/>
+              <w:bottom w:val="single" w:sz="4" w:color="000000"/>
+              <w:right w:val="single" w:sz="4" w:color="000000"/>
+            </w:tcBorders>
+            <w:vAlign w:val="center"/>
+          </w:tcPr>
+          <w:p>
+            <w:pPr>
+              <w:spacing w:line="360" w:lineRule="auto" w:before="0" w:after="160"/>
+              <w:ind w:firstLine="0"/>
+              <w:jc w:val="left"/>
+            </w:pPr>
+            <w:r>
+              <w:rPr>
+                <w:rFonts w:ascii="SimSun" w:hAnsi="SimSun" w:eastAsia="SimSun"/>
+                <w:b w:val="0"/>
+                <w:i w:val="0"/>
+                <w:color w:val="000000"/>
+                <w:sz w:val="24"/>
+              </w:rPr>
+              <w:t>长文本内容</w:t>
+            </w:r>
+          </w:p>
+        </w:tc>
+        <w:tc>
+          <w:tcPr>
+            <w:tcW w:type="dxa" w:w="3120"/>
+            <w:tcBorders>
+              <w:top w:val="single" w:sz="4" w:color="000000"/>
+              <w:left w:val="single" w:sz="4" w:color="000000"/>
+              <w:bottom w:val="single" w:sz="4" w:color="000000"/>
+              <w:right w:val="single" w:sz="4" w:color="000000"/>
+            </w:tcBorders>
+            <w:vAlign w:val="center"/>
+          </w:tcPr>
+          <w:p>
+            <w:pPr>
+              <w:spacing w:line="360" w:lineRule="auto" w:before="0" w:after="160"/>
+              <w:ind w:firstLine="0"/>
+              <w:jc w:val="center"/>
+            </w:pPr>
+            <w:r>
+              <w:rPr>
+                <w:rFonts w:ascii="SimSun" w:hAnsi="SimSun" w:eastAsia="SimSun"/>
+                <w:b w:val="0"/>
+                <w:i w:val="0"/>
+                <w:color w:val="000000"/>
+                <w:sz w:val="24"/>
+              </w:rPr>
+              <w:t>测试</w:t>
+            </w:r>
+          </w:p>
+        </w:tc>
+        <w:tc>
+          <w:tcPr>
+            <w:tcW w:type="dxa" w:w="3120"/>
+            <w:tcBorders>
+              <w:top w:val="single" w:sz="4" w:color="000000"/>
+              <w:left w:val="single" w:sz="4" w:color="000000"/>
+              <w:bottom w:val="single" w:sz="4" w:color="000000"/>
+              <w:right w:val="single" w:sz="4" w:color="000000"/>
+            </w:tcBorders>
+            <w:vAlign w:val="center"/>
+          </w:tcPr>
+          <w:p>
+            <w:pPr>
+              <w:spacing w:line="360" w:lineRule="auto" w:before="0" w:after="160"/>
+              <w:ind w:firstLine="0"/>
+              <w:jc w:val="right"/>
+            </w:pPr>
+            <w:r>
+              <w:rPr>
+                <w:rFonts w:ascii="SimSun" w:hAnsi="SimSun" w:eastAsia="SimSun"/>
+                <w:b w:val="0"/>
+                <w:i w:val="0"/>
+                <w:color w:val="000000"/>
+                <w:sz w:val="24"/>
+              </w:rPr>
+              <w:t>300</w:t>
+            </w:r>
+          </w:p>
+        </w:tc>
+      </w:tr>
+    </w:tbl>
+    <w:p>
+      <w:pPr>
+        <w:pStyle w:val="Heading2"/>
+        <w:spacing w:line="288" w:lineRule="auto" w:before="240" w:after="120"/>
+        <w:ind w:firstLine="0"/>
+        <w:jc w:val="left"/>
+      </w:pPr>
+      <w:r>
+        <w:rPr>
+          <w:rFonts w:ascii="SimSun" w:hAnsi="SimSun" w:eastAsia="SimSun"/>
+          <w:b/>
+          <w:i w:val="0"/>
+          <w:color w:val="000000"/>
+          <w:sz w:val="40"/>
+        </w:rPr>
+        <w:t>带格式的表格</w:t>
+      </w:r>
+    </w:p>
+    <w:tbl>
+      <w:tblPr>
+        <w:tblW w:type="auto" w:w="0"/>
+        <w:jc w:val="center"/>
+        <w:tblLook w:firstColumn="1" w:firstRow="1" w:lastColumn="0" w:lastRow="0" w:noHBand="0" w:noVBand="1" w:val="04A0"/>
+      </w:tblPr>
+      <w:tblGrid>
+        <w:gridCol w:w="3120"/>
+        <w:gridCol w:w="3120"/>
+        <w:gridCol w:w="3120"/>
+      </w:tblGrid>
+      <w:tr>
+        <w:tc>
+          <w:tcPr>
+            <w:tcW w:type="dxa" w:w="3120"/>
+            <w:tcBorders>
+              <w:top w:val="single" w:sz="4" w:color="000000"/>
+              <w:left w:val="single" w:sz="4" w:color="000000"/>
+              <w:bottom w:val="single" w:sz="4" w:color="000000"/>
+              <w:right w:val="single" w:sz="4" w:color="000000"/>
+            </w:tcBorders>
+            <w:vAlign w:val="center"/>
+            <w:shd w:fill="E5E7EB"/>
+          </w:tcPr>
+          <w:p>
+            <w:pPr>
+              <w:spacing w:line="360" w:lineRule="auto" w:before="0" w:after="160"/>
+              <w:ind w:firstLine="0"/>
+              <w:jc w:val="left"/>
+            </w:pPr>
+            <w:r>
+              <w:rPr>
+                <w:rFonts w:ascii="SimSun" w:hAnsi="SimSun" w:eastAsia="SimSun"/>
+                <w:b/>
+                <w:i w:val="0"/>
+                <w:color w:val="000000"/>
+                <w:sz w:val="24"/>
+              </w:rPr>
+              <w:t>功能</w:t>
+            </w:r>
+          </w:p>
+        </w:tc>
+        <w:tc>
+          <w:tcPr>
+            <w:tcW w:type="dxa" w:w="3120"/>
+            <w:tcBorders>
+              <w:top w:val="single" w:sz="4" w:color="000000"/>
+              <w:left w:val="single" w:sz="4" w:color="000000"/>
+              <w:bottom w:val="single" w:sz="4" w:color="000000"/>
+              <w:right w:val="single" w:sz="4" w:color="000000"/>
+            </w:tcBorders>
+            <w:vAlign w:val="center"/>
+            <w:shd w:fill="E5E7EB"/>
+          </w:tcPr>
+          <w:p>
+            <w:pPr>
+              <w:spacing w:line="360" w:lineRule="auto" w:before="0" w:after="160"/>
+              <w:ind w:firstLine="0"/>
+              <w:jc w:val="left"/>
+            </w:pPr>
+            <w:r>
+              <w:rPr>
+                <w:rFonts w:ascii="SimSun" w:hAnsi="SimSun" w:eastAsia="SimSun"/>
+                <w:b/>
+                <w:i w:val="0"/>
+                <w:color w:val="000000"/>
+                <w:sz w:val="24"/>
+              </w:rPr>
+              <w:t>状态</w:t>
+            </w:r>
+          </w:p>
+        </w:tc>
+        <w:tc>
+          <w:tcPr>
+            <w:tcW w:type="dxa" w:w="3120"/>
+            <w:tcBorders>
+              <w:top w:val="single" w:sz="4" w:color="000000"/>
+              <w:left w:val="single" w:sz="4" w:color="000000"/>
+              <w:bottom w:val="single" w:sz="4" w:color="000000"/>
+              <w:right w:val="single" w:sz="4" w:color="000000"/>
+            </w:tcBorders>
+            <w:vAlign w:val="center"/>
+            <w:shd w:fill="E5E7EB"/>
+          </w:tcPr>
+          <w:p>
+            <w:pPr>
+              <w:spacing w:line="360" w:lineRule="auto" w:before="0" w:after="160"/>
+              <w:ind w:firstLine="0"/>
+              <w:jc w:val="left"/>
+            </w:pPr>
+            <w:r>
+              <w:rPr>
+                <w:rFonts w:ascii="SimSun" w:hAnsi="SimSun" w:eastAsia="SimSun"/>
+                <w:b/>
+                <w:i w:val="0"/>
+                <w:color w:val="000000"/>
+                <w:sz w:val="24"/>
+              </w:rPr>
+              <w:t>说明</w:t>
+            </w:r>
+          </w:p>
+        </w:tc>
+      </w:tr>
+      <w:tr>
+        <w:tc>
+          <w:tcPr>
+            <w:tcW w:type="dxa" w:w="3120"/>
+            <w:tcBorders>
+              <w:top w:val="single" w:sz="4" w:color="000000"/>
+              <w:left w:val="single" w:sz="4" w:color="000000"/>
+              <w:bottom w:val="single" w:sz="4" w:color="000000"/>
+              <w:right w:val="single" w:sz="4" w:color="000000"/>
+            </w:tcBorders>
+            <w:vAlign w:val="center"/>
+          </w:tcPr>
+          <w:p>
+            <w:pPr>
+              <w:spacing w:line="360" w:lineRule="auto" w:before="0" w:after="160"/>
+              <w:ind w:firstLine="0"/>
+              <w:jc w:val="left"/>
+            </w:pPr>
+            <w:r>
+              <w:rPr>
+                <w:rFonts w:ascii="SimSun" w:hAnsi="SimSun" w:eastAsia="SimSun"/>
+                <w:b/>
+                <w:i w:val="0"/>
+                <w:color w:val="000000"/>
+                <w:sz w:val="24"/>
+              </w:rPr>
+              <w:t>加粗</w:t>
+            </w:r>
+          </w:p>
+        </w:tc>
+        <w:tc>
+          <w:tcPr>
+            <w:tcW w:type="dxa" w:w="3120"/>
+            <w:tcBorders>
+              <w:top w:val="single" w:sz="4" w:color="000000"/>
+              <w:left w:val="single" w:sz="4" w:color="000000"/>
+              <w:bottom w:val="single" w:sz="4" w:color="000000"/>
+              <w:right w:val="single" w:sz="4" w:color="000000"/>
+            </w:tcBorders>
+            <w:vAlign w:val="center"/>
+          </w:tcPr>
+          <w:p>
+            <w:pPr>
+              <w:spacing w:line="360" w:lineRule="auto" w:before="0" w:after="160"/>
+              <w:ind w:firstLine="0"/>
+              <w:jc w:val="left"/>
+            </w:pPr>
+            <w:r>
+              <w:rPr>
+                <w:rFonts w:ascii="SimSun" w:hAnsi="SimSun" w:eastAsia="SimSun"/>
+                <w:b w:val="0"/>
+                <w:i w:val="0"/>
+                <w:color w:val="000000"/>
+                <w:sz w:val="24"/>
+              </w:rPr>
+              <w:t>✅</w:t>
+            </w:r>
+          </w:p>
+        </w:tc>
+        <w:tc>
+          <w:tcPr>
+            <w:tcW w:type="dxa" w:w="3120"/>
+            <w:tcBorders>
+              <w:top w:val="single" w:sz="4" w:color="000000"/>
+              <w:left w:val="single" w:sz="4" w:color="000000"/>
+              <w:bottom w:val="single" w:sz="4" w:color="000000"/>
+              <w:right w:val="single" w:sz="4" w:color="000000"/>
+            </w:tcBorders>
+            <w:vAlign w:val="center"/>
+          </w:tcPr>
+          <w:p>
+            <w:pPr>
+              <w:spacing w:line="360" w:lineRule="auto" w:before="0" w:after="160"/>
+              <w:ind w:firstLine="0"/>
+              <w:jc w:val="left"/>
+            </w:pPr>
+            <w:r>
+              <w:rPr>
+                <w:rFonts w:ascii="SimSun" w:hAnsi="SimSun" w:eastAsia="SimSun"/>
+                <w:b w:val="0"/>
+                <w:i w:val="0"/>
+                <w:color w:val="000000"/>
+                <w:sz w:val="24"/>
+              </w:rPr>
+              <w:t>支持</w:t>
+            </w:r>
+          </w:p>
+        </w:tc>
+      </w:tr>
+      <w:tr>
+        <w:tc>
+          <w:tcPr>
+            <w:tcW w:type="dxa" w:w="3120"/>
+            <w:tcBorders>
+              <w:top w:val="single" w:sz="4" w:color="000000"/>
+              <w:left w:val="single" w:sz="4" w:color="000000"/>
+              <w:bottom w:val="single" w:sz="4" w:color="000000"/>
+              <w:right w:val="single" w:sz="4" w:color="000000"/>
+            </w:tcBorders>
+            <w:vAlign w:val="center"/>
+          </w:tcPr>
+          <w:p>
+            <w:pPr>
+              <w:spacing w:line="360" w:lineRule="auto" w:before="0" w:after="160"/>
+              <w:ind w:firstLine="0"/>
+              <w:jc w:val="left"/>
+            </w:pPr>
+            <w:r>
+              <w:rPr>
+                <w:rFonts w:ascii="SimSun" w:hAnsi="SimSun" w:eastAsia="SimSun"/>
+                <w:b w:val="0"/>
+                <w:i/>
+                <w:color w:val="000000"/>
+                <w:sz w:val="24"/>
+              </w:rPr>
+              <w:t>斜体</w:t>
+            </w:r>
+          </w:p>
+        </w:tc>
+        <w:tc>
+          <w:tcPr>
+            <w:tcW w:type="dxa" w:w="3120"/>
+            <w:tcBorders>
+              <w:top w:val="single" w:sz="4" w:color="000000"/>
+              <w:left w:val="single" w:sz="4" w:color="000000"/>
+              <w:bottom w:val="single" w:sz="4" w:color="000000"/>
+              <w:right w:val="single" w:sz="4" w:color="000000"/>
+            </w:tcBorders>
+            <w:vAlign w:val="center"/>
+          </w:tcPr>
+          <w:p>
+            <w:pPr>
+              <w:spacing w:line="360" w:lineRule="auto" w:before="0" w:after="160"/>
+              <w:ind w:firstLine="0"/>
+              <w:jc w:val="left"/>
+            </w:pPr>
+            <w:r>
+              <w:rPr>
+                <w:rFonts w:ascii="SimSun" w:hAnsi="SimSun" w:eastAsia="SimSun"/>
+                <w:b w:val="0"/>
+                <w:i w:val="0"/>
+                <w:color w:val="000000"/>
+                <w:sz w:val="24"/>
+              </w:rPr>
+              <w:t>✅</w:t>
+            </w:r>
+          </w:p>
+        </w:tc>
+        <w:tc>
+          <w:tcPr>
+            <w:tcW w:type="dxa" w:w="3120"/>
+            <w:tcBorders>
+              <w:top w:val="single" w:sz="4" w:color="000000"/>
+              <w:left w:val="single" w:sz="4" w:color="000000"/>
+              <w:bottom w:val="single" w:sz="4" w:color="000000"/>
+              <w:right w:val="single" w:sz="4" w:color="000000"/>
+            </w:tcBorders>
+            <w:vAlign w:val="center"/>
+          </w:tcPr>
+          <w:p>
+            <w:pPr>
+              <w:spacing w:line="360" w:lineRule="auto" w:before="0" w:after="160"/>
+              <w:ind w:firstLine="0"/>
+              <w:jc w:val="left"/>
+            </w:pPr>
+            <w:r>
+              <w:rPr>
+                <w:rFonts w:ascii="SimSun" w:hAnsi="SimSun" w:eastAsia="SimSun"/>
+                <w:b w:val="0"/>
+                <w:i w:val="0"/>
+                <w:color w:val="000000"/>
+                <w:sz w:val="24"/>
+              </w:rPr>
+              <w:t>支持</w:t>
+            </w:r>
+          </w:p>
+        </w:tc>
+      </w:tr>
+      <w:tr>
+        <w:tc>
+          <w:tcPr>
+            <w:tcW w:type="dxa" w:w="3120"/>
+            <w:tcBorders>
+              <w:top w:val="single" w:sz="4" w:color="000000"/>
+              <w:left w:val="single" w:sz="4" w:color="000000"/>
+              <w:bottom w:val="single" w:sz="4" w:color="000000"/>
+              <w:right w:val="single" w:sz="4" w:color="000000"/>
+            </w:tcBorders>
+            <w:vAlign w:val="center"/>
+          </w:tcPr>
+          <w:p>
+            <w:pPr>
+              <w:spacing w:line="360" w:lineRule="auto" w:before="0" w:after="160"/>
+              <w:ind w:firstLine="0"/>
+              <w:jc w:val="left"/>
+            </w:pPr>
+            <w:r>
+              <w:rPr>
+                <w:rFonts w:ascii="Courier New" w:hAnsi="Courier New" w:eastAsia="SimSun"/>
+                <w:b w:val="0"/>
+                <w:i w:val="0"/>
+                <w:color w:val="000000"/>
+                <w:sz w:val="20"/>
+                <w:shd w:val="clear" w:color="auto" w:fill="F5F7F9"/>
+              </w:rPr>
+              <w:t>代码</w:t>
+            </w:r>
+          </w:p>
+        </w:tc>
+        <w:tc>
+          <w:tcPr>
+            <w:tcW w:type="dxa" w:w="3120"/>
+            <w:tcBorders>
+              <w:top w:val="single" w:sz="4" w:color="000000"/>
+              <w:left w:val="single" w:sz="4" w:color="000000"/>
+              <w:bottom w:val="single" w:sz="4" w:color="000000"/>
+              <w:right w:val="single" w:sz="4" w:color="000000"/>
+            </w:tcBorders>
+            <w:vAlign w:val="center"/>
+          </w:tcPr>
+          <w:p>
+            <w:pPr>
+              <w:spacing w:line="360" w:lineRule="auto" w:before="0" w:after="160"/>
+              <w:ind w:firstLine="0"/>
+              <w:jc w:val="left"/>
+            </w:pPr>
+            <w:r>
+              <w:rPr>
+                <w:rFonts w:ascii="SimSun" w:hAnsi="SimSun" w:eastAsia="SimSun"/>
+                <w:b w:val="0"/>
+                <w:i w:val="0"/>
+                <w:color w:val="000000"/>
+                <w:sz w:val="24"/>
+              </w:rPr>
+              <w:t>⚠️</w:t>
+            </w:r>
+          </w:p>
+        </w:tc>
+        <w:tc>
+          <w:tcPr>
+            <w:tcW w:type="dxa" w:w="3120"/>
+            <w:tcBorders>
+              <w:top w:val="single" w:sz="4" w:color="000000"/>
+              <w:left w:val="single" w:sz="4" w:color="000000"/>
+              <w:bottom w:val="single" w:sz="4" w:color="000000"/>
+              <w:right w:val="single" w:sz="4" w:color="000000"/>
+            </w:tcBorders>
+            <w:vAlign w:val="center"/>
+          </w:tcPr>
+          <w:p>
+            <w:pPr>
+              <w:spacing w:line="360" w:lineRule="auto" w:before="0" w:after="160"/>
+              <w:ind w:firstLine="0"/>
+              <w:jc w:val="left"/>
+            </w:pPr>
+            <w:r>
+              <w:rPr>
+                <w:rFonts w:ascii="SimSun" w:hAnsi="SimSun" w:eastAsia="SimSun"/>
+                <w:b w:val="0"/>
+                <w:i w:val="0"/>
+                <w:color w:val="000000"/>
+                <w:sz w:val="24"/>
+              </w:rPr>
+              <w:t>部分支持</w:t>
+            </w:r>
+          </w:p>
+        </w:tc>
+      </w:tr>
+    </w:tbl>
+    <w:p>
+      <w:pPr>
+        <w:spacing w:before="120" w:after="120"/>
+        <w:pBdr>
+          <w:bottom w:val="single" w:sz="6" w:space="1" w:color="CCCCCC"/>
+        </w:pBdr>
+      </w:pPr>
+    </w:p>
+    <w:p>
+      <w:pPr>
+        <w:pStyle w:val="Heading2"/>
+        <w:spacing w:line="288" w:lineRule="auto" w:before="240" w:after="120"/>
+        <w:ind w:firstLine="0"/>
+        <w:jc w:val="left"/>
+      </w:pPr>
+      <w:r>
+        <w:rPr>
+          <w:rFonts w:ascii="SimSun" w:hAnsi="SimSun" w:eastAsia="SimSun"/>
+          <w:b/>
+          <w:i w:val="0"/>
+          <w:color w:val="000000"/>
+          <w:sz w:val="40"/>
+        </w:rPr>
+        <w:t>代码块测试</w:t>
+      </w:r>
+    </w:p>
+    <w:p>
+      <w:pPr>
+        <w:pStyle w:val="Heading3"/>
+        <w:spacing w:line="288" w:lineRule="auto" w:before="240" w:after="120"/>
+        <w:ind w:firstLine="0"/>
+        <w:jc w:val="left"/>
+      </w:pPr>
+      <w:r>
+        <w:rPr>
+          <w:rFonts w:ascii="SimSun" w:hAnsi="SimSun" w:eastAsia="SimSun"/>
+          <w:b/>
+          <w:i w:val="0"/>
+          <w:color w:val="000000"/>
+          <w:sz w:val="36"/>
+        </w:rPr>
+        <w:t>Python</w:t>
+      </w:r>
+    </w:p>
+    <w:p>
+      <w:pPr>
+        <w:spacing w:line="288" w:lineRule="auto" w:before="0" w:after="0"/>
+        <w:ind w:firstLine="0"/>
+        <w:jc w:val="left"/>
+        <w:shd w:val="clear" w:color="auto" w:fill="F5F7F9"/>
+      </w:pPr>
+      <w:r>
+        <w:rPr>
+          <w:rFonts w:ascii="Courier New" w:hAnsi="Courier New" w:eastAsia="Courier New"/>
+          <w:b w:val="0"/>
+          <w:i w:val="0"/>
+          <w:color w:val="000000"/>
+          <w:sz w:val="20"/>
+        </w:rPr>
+        <w:t>def hello(name: str) -&gt; str:</w:t>
+      </w:r>
+    </w:p>
+    <w:p>
+      <w:pPr>
+        <w:spacing w:line="288" w:lineRule="auto" w:before="0" w:after="0"/>
+        <w:ind w:firstLine="0"/>
+        <w:jc w:val="left"/>
+        <w:shd w:val="clear" w:color="auto" w:fill="F5F7F9"/>
+      </w:pPr>
+      <w:r>
+        <w:rPr>
+          <w:rFonts w:ascii="Courier New" w:hAnsi="Courier New" w:eastAsia="Courier New"/>
+          <w:b w:val="0"/>
+          <w:i w:val="0"/>
+          <w:color w:val="000000"/>
+          <w:sz w:val="20"/>
+        </w:rPr>
+        <w:t xml:space="preserve">    """返回问候语"""</w:t>
+      </w:r>
+    </w:p>
+    <w:p>
+      <w:pPr>
+        <w:spacing w:line="288" w:lineRule="auto" w:before="0" w:after="0"/>
+        <w:ind w:firstLine="0"/>
+        <w:jc w:val="left"/>
+        <w:shd w:val="clear" w:color="auto" w:fill="F5F7F9"/>
+      </w:pPr>
+      <w:r>
+        <w:rPr>
+          <w:rFonts w:ascii="Courier New" w:hAnsi="Courier New" w:eastAsia="Courier New"/>
+          <w:b w:val="0"/>
+          <w:i w:val="0"/>
+          <w:color w:val="000000"/>
+          <w:sz w:val="20"/>
+        </w:rPr>
+        <w:t xml:space="preserve">    return f"你好，{name}！"</w:t>
+      </w:r>
+    </w:p>
+    <w:p>
+      <w:pPr>
+        <w:spacing w:line="288" w:lineRule="auto" w:before="0" w:after="0"/>
+        <w:ind w:firstLine="0"/>
+        <w:jc w:val="left"/>
+        <w:shd w:val="clear" w:color="auto" w:fill="F5F7F9"/>
+      </w:pPr>
+      <w:r>
+        <w:rPr>
+          <w:rFonts w:ascii="Courier New" w:hAnsi="Courier New" w:eastAsia="Courier New"/>
+          <w:b w:val="0"/>
+          <w:i w:val="0"/>
+          <w:color w:val="000000"/>
+          <w:sz w:val="20"/>
+        </w:rPr>
+        <w:t xml:space="preserve"> </w:t>
+      </w:r>
+    </w:p>
+    <w:p>
+      <w:pPr>
+        <w:spacing w:line="288" w:lineRule="auto" w:before="0" w:after="0"/>
+        <w:ind w:firstLine="0"/>
+        <w:jc w:val="left"/>
+        <w:shd w:val="clear" w:color="auto" w:fill="F5F7F9"/>
+      </w:pPr>
+      <w:r>
+        <w:rPr>
+          <w:rFonts w:ascii="Courier New" w:hAnsi="Courier New" w:eastAsia="Courier New"/>
+          <w:b w:val="0"/>
+          <w:i w:val="0"/>
+          <w:color w:val="000000"/>
+          <w:sz w:val="20"/>
+        </w:rPr>
+        <w:t>print(hello("世界"))</w:t>
+      </w:r>
+    </w:p>
+    <w:p>
+      <w:pPr>
+        <w:pStyle w:val="Heading3"/>
+        <w:spacing w:line="288" w:lineRule="auto" w:before="240" w:after="120"/>
+        <w:ind w:firstLine="0"/>
+        <w:jc w:val="left"/>
+      </w:pPr>
+      <w:r>
+        <w:rPr>
+          <w:rFonts w:ascii="SimSun" w:hAnsi="SimSun" w:eastAsia="SimSun"/>
+          <w:b/>
+          <w:i w:val="0"/>
+          <w:color w:val="000000"/>
+          <w:sz w:val="36"/>
+        </w:rPr>
+        <w:t>JavaScript</w:t>
+      </w:r>
+    </w:p>
+    <w:p>
+      <w:pPr>
+        <w:spacing w:line="288" w:lineRule="auto" w:before="0" w:after="0"/>
+        <w:ind w:firstLine="0"/>
+        <w:jc w:val="left"/>
+        <w:shd w:val="clear" w:color="auto" w:fill="F5F7F9"/>
+      </w:pPr>
+      <w:r>
+        <w:rPr>
+          <w:rFonts w:ascii="Courier New" w:hAnsi="Courier New" w:eastAsia="Courier New"/>
+          <w:b w:val="0"/>
+          <w:i w:val="0"/>
+          <w:color w:val="000000"/>
+          <w:sz w:val="20"/>
+        </w:rPr>
+        <w:t>function fibonacci(n) {</w:t>
+      </w:r>
+    </w:p>
+    <w:p>
+      <w:pPr>
+        <w:spacing w:line="288" w:lineRule="auto" w:before="0" w:after="0"/>
+        <w:ind w:firstLine="0"/>
+        <w:jc w:val="left"/>
+        <w:shd w:val="clear" w:color="auto" w:fill="F5F7F9"/>
+      </w:pPr>
+      <w:r>
+        <w:rPr>
+          <w:rFonts w:ascii="Courier New" w:hAnsi="Courier New" w:eastAsia="Courier New"/>
+          <w:b w:val="0"/>
+          <w:i w:val="0"/>
+          <w:color w:val="000000"/>
+          <w:sz w:val="20"/>
+        </w:rPr>
+        <w:t xml:space="preserve">  if (n &lt;= 1) return n;</w:t>
+      </w:r>
+    </w:p>
+    <w:p>
+      <w:pPr>
+        <w:spacing w:line="288" w:lineRule="auto" w:before="0" w:after="0"/>
+        <w:ind w:firstLine="0"/>
+        <w:jc w:val="left"/>
+        <w:shd w:val="clear" w:color="auto" w:fill="F5F7F9"/>
+      </w:pPr>
+      <w:r>
+        <w:rPr>
+          <w:rFonts w:ascii="Courier New" w:hAnsi="Courier New" w:eastAsia="Courier New"/>
+          <w:b w:val="0"/>
+          <w:i w:val="0"/>
+          <w:color w:val="000000"/>
+          <w:sz w:val="20"/>
+        </w:rPr>
+        <w:t xml:space="preserve">  return fibonacci(n - 1) + fibonacci(n - 2);</w:t>
+      </w:r>
+    </w:p>
+    <w:p>
+      <w:pPr>
+        <w:spacing w:line="288" w:lineRule="auto" w:before="0" w:after="0"/>
+        <w:ind w:firstLine="0"/>
+        <w:jc w:val="left"/>
+        <w:shd w:val="clear" w:color="auto" w:fill="F5F7F9"/>
+      </w:pPr>
+      <w:r>
+        <w:rPr>
+          <w:rFonts w:ascii="Courier New" w:hAnsi="Courier New" w:eastAsia="Courier New"/>
+          <w:b w:val="0"/>
+          <w:i w:val="0"/>
+          <w:color w:val="000000"/>
+          <w:sz w:val="20"/>
+        </w:rPr>
+        <w:t>}</w:t>
+      </w:r>
+    </w:p>
+    <w:p>
+      <w:pPr>
+        <w:spacing w:line="288" w:lineRule="auto" w:before="0" w:after="0"/>
+        <w:ind w:firstLine="0"/>
+        <w:jc w:val="left"/>
+        <w:shd w:val="clear" w:color="auto" w:fill="F5F7F9"/>
+      </w:pPr>
+      <w:r>
+        <w:rPr>
+          <w:rFonts w:ascii="Courier New" w:hAnsi="Courier New" w:eastAsia="Courier New"/>
+          <w:b w:val="0"/>
+          <w:i w:val="0"/>
+          <w:color w:val="000000"/>
+          <w:sz w:val="20"/>
+        </w:rPr>
+        <w:t xml:space="preserve"> </w:t>
+      </w:r>
+    </w:p>
+    <w:p>
+      <w:pPr>
+        <w:spacing w:line="288" w:lineRule="auto" w:before="0" w:after="0"/>
+        <w:ind w:firstLine="0"/>
+        <w:jc w:val="left"/>
+        <w:shd w:val="clear" w:color="auto" w:fill="F5F7F9"/>
+      </w:pPr>
+      <w:r>
+        <w:rPr>
+          <w:rFonts w:ascii="Courier New" w:hAnsi="Courier New" w:eastAsia="Courier New"/>
+          <w:b w:val="0"/>
+          <w:i w:val="0"/>
+          <w:color w:val="000000"/>
+          <w:sz w:val="20"/>
+        </w:rPr>
+        <w:t>console.log(fibonacci(10));</w:t>
+      </w:r>
+    </w:p>
+    <w:p>
+      <w:pPr>
+        <w:pStyle w:val="Heading3"/>
+        <w:spacing w:line="288" w:lineRule="auto" w:before="240" w:after="120"/>
+        <w:ind w:firstLine="0"/>
+        <w:jc w:val="left"/>
+      </w:pPr>
+      <w:r>
+        <w:rPr>
+          <w:rFonts w:ascii="SimSun" w:hAnsi="SimSun" w:eastAsia="SimSun"/>
+          <w:b/>
+          <w:i w:val="0"/>
+          <w:color w:val="000000"/>
+          <w:sz w:val="36"/>
+        </w:rPr>
+        <w:t>无语言标记</w:t>
+      </w:r>
+    </w:p>
+    <w:p>
+      <w:pPr>
+        <w:spacing w:line="288" w:lineRule="auto" w:before="0" w:after="0"/>
+        <w:ind w:firstLine="0"/>
+        <w:jc w:val="left"/>
+        <w:shd w:val="clear" w:color="auto" w:fill="F5F7F9"/>
+      </w:pPr>
+      <w:r>
+        <w:rPr>
+          <w:rFonts w:ascii="Courier New" w:hAnsi="Courier New" w:eastAsia="Courier New"/>
+          <w:b w:val="0"/>
+          <w:i w:val="0"/>
+          <w:color w:val="000000"/>
+          <w:sz w:val="20"/>
+        </w:rPr>
+        <w:t>这是一段无语言标记的代码块</w:t>
+      </w:r>
+    </w:p>
+    <w:p>
+      <w:pPr>
+        <w:spacing w:line="288" w:lineRule="auto" w:before="0" w:after="0"/>
+        <w:ind w:firstLine="0"/>
+        <w:jc w:val="left"/>
+        <w:shd w:val="clear" w:color="auto" w:fill="F5F7F9"/>
+      </w:pPr>
+      <w:r>
+        <w:rPr>
+          <w:rFonts w:ascii="Courier New" w:hAnsi="Courier New" w:eastAsia="Courier New"/>
+          <w:b w:val="0"/>
+          <w:i w:val="0"/>
+          <w:color w:val="000000"/>
+          <w:sz w:val="20"/>
+        </w:rPr>
+        <w:t>用于测试默认代码样式</w:t>
+      </w:r>
+    </w:p>
+    <w:p>
+      <w:pPr>
+        <w:spacing w:before="120" w:after="120"/>
+        <w:pBdr>
+          <w:bottom w:val="single" w:sz="6" w:space="1" w:color="CCCCCC"/>
+        </w:pBdr>
+      </w:pPr>
+    </w:p>
+    <w:p>
+      <w:pPr>
+        <w:pStyle w:val="Heading2"/>
+        <w:spacing w:line="288" w:lineRule="auto" w:before="240" w:after="120"/>
+        <w:ind w:firstLine="0"/>
+        <w:jc w:val="left"/>
+      </w:pPr>
+      <w:r>
+        <w:rPr>
+          <w:rFonts w:ascii="SimSun" w:hAnsi="SimSun" w:eastAsia="SimSun"/>
+          <w:b/>
+          <w:i w:val="0"/>
+          <w:color w:val="000000"/>
+          <w:sz w:val="40"/>
+        </w:rPr>
+        <w:t>引用块测试</w:t>
+      </w:r>
+    </w:p>
+    <w:p>
+      <w:pPr>
+        <w:spacing w:line="336" w:lineRule="auto" w:before="160" w:after="160"/>
+        <w:ind w:firstLine="0" w:left="360"/>
+        <w:jc w:val="left"/>
+        <w:shd w:val="clear" w:color="auto" w:fill="F5F7F9"/>
+      </w:pPr>
+      <w:r>
+        <w:rPr>
+          <w:rFonts w:ascii="SimSun" w:hAnsi="SimSun" w:eastAsia="SimSun"/>
+          <w:b w:val="0"/>
+          <w:i/>
+          <w:color w:val="000000"/>
+          <w:sz w:val="24"/>
+        </w:rPr>
+        <w:t>这是一级引用。</w:t>
+      </w:r>
+    </w:p>
+    <w:p>
+      <w:pPr>
+        <w:spacing w:line="360" w:lineRule="auto" w:before="0" w:after="160"/>
         <w:ind w:firstLine="480"/>
         <w:jc w:val="left"/>
       </w:pPr>
@@ -108,13 +1901,92 @@
           <w:color w:val="000000"/>
           <w:sz w:val="24"/>
         </w:rPr>
-        <w:t>列表项一（有序）</w:t>
+        <w:t>&gt;</w:t>
       </w:r>
     </w:p>
     <w:p>
       <w:pPr>
-        <w:pStyle w:val="ListNumber"/>
-        <w:spacing w:line="384" w:lineRule="auto" w:before="0" w:after="160"/>
+        <w:spacing w:line="336" w:lineRule="auto" w:before="160" w:after="160"/>
+        <w:ind w:firstLine="0" w:left="360"/>
+        <w:jc w:val="left"/>
+        <w:shd w:val="clear" w:color="auto" w:fill="F5F7F9"/>
+      </w:pPr>
+      <w:r>
+        <w:rPr>
+          <w:rFonts w:ascii="SimSun" w:hAnsi="SimSun" w:eastAsia="SimSun"/>
+          <w:b w:val="0"/>
+          <w:i/>
+          <w:color w:val="000000"/>
+          <w:sz w:val="24"/>
+        </w:rPr>
+        <w:t>&gt; 这是嵌套引用。</w:t>
+      </w:r>
+    </w:p>
+    <w:p>
+      <w:pPr>
+        <w:spacing w:line="336" w:lineRule="auto" w:before="160" w:after="160"/>
+        <w:ind w:firstLine="0" w:left="360"/>
+        <w:jc w:val="left"/>
+        <w:shd w:val="clear" w:color="auto" w:fill="F5F7F9"/>
+      </w:pPr>
+      <w:r>
+        <w:rPr>
+          <w:rFonts w:ascii="SimSun" w:hAnsi="SimSun" w:eastAsia="SimSun"/>
+          <w:b w:val="0"/>
+          <w:i/>
+          <w:color w:val="000000"/>
+          <w:sz w:val="24"/>
+        </w:rPr>
+        <w:t>&gt;</w:t>
+      </w:r>
+    </w:p>
+    <w:p>
+      <w:pPr>
+        <w:spacing w:line="336" w:lineRule="auto" w:before="160" w:after="160"/>
+        <w:ind w:firstLine="0" w:left="360"/>
+        <w:jc w:val="left"/>
+        <w:shd w:val="clear" w:color="auto" w:fill="F5F7F9"/>
+      </w:pPr>
+      <w:r>
+        <w:rPr>
+          <w:rFonts w:ascii="SimSun" w:hAnsi="SimSun" w:eastAsia="SimSun"/>
+          <w:b w:val="0"/>
+          <w:i/>
+          <w:color w:val="000000"/>
+          <w:sz w:val="24"/>
+        </w:rPr>
+        <w:t>&gt; &gt; 三级嵌套引用。</w:t>
+      </w:r>
+    </w:p>
+    <w:p>
+      <w:pPr>
+        <w:spacing w:before="120" w:after="120"/>
+        <w:pBdr>
+          <w:bottom w:val="single" w:sz="6" w:space="1" w:color="CCCCCC"/>
+        </w:pBdr>
+      </w:pPr>
+    </w:p>
+    <w:p>
+      <w:pPr>
+        <w:pStyle w:val="Heading2"/>
+        <w:spacing w:line="288" w:lineRule="auto" w:before="240" w:after="120"/>
+        <w:ind w:firstLine="0"/>
+        <w:jc w:val="left"/>
+      </w:pPr>
+      <w:r>
+        <w:rPr>
+          <w:rFonts w:ascii="SimSun" w:hAnsi="SimSun" w:eastAsia="SimSun"/>
+          <w:b/>
+          <w:i w:val="0"/>
+          <w:color w:val="000000"/>
+          <w:sz w:val="40"/>
+        </w:rPr>
+        <w:t>综合测试段落</w:t>
+      </w:r>
+    </w:p>
+    <w:p>
+      <w:pPr>
+        <w:spacing w:line="360" w:lineRule="auto" w:before="0" w:after="160"/>
         <w:ind w:firstLine="480"/>
         <w:jc w:val="left"/>
       </w:pPr>
@@ -126,66 +1998,138 @@
           <w:color w:val="000000"/>
           <w:sz w:val="24"/>
         </w:rPr>
-        <w:t>列表项二（有序）</w:t>
+        <w:t>这是一个综合测试段落，包含</w:t>
       </w:r>
-    </w:p>
-    <w:p/>
-    <w:p>
-      <w:pPr>
-        <w:spacing w:line="288" w:lineRule="auto" w:before="0" w:after="0"/>
-        <w:ind w:firstLine="0"/>
-        <w:jc w:val="left"/>
-      </w:pPr>
+      <w:r>
+        <w:rPr>
+          <w:rFonts w:ascii="SimSun" w:hAnsi="SimSun" w:eastAsia="SimSun"/>
+          <w:b/>
+          <w:i w:val="0"/>
+          <w:color w:val="000000"/>
+          <w:sz w:val="24"/>
+        </w:rPr>
+        <w:t>加粗文字</w:t>
+      </w:r>
+      <w:r>
+        <w:rPr>
+          <w:rFonts w:ascii="SimSun" w:hAnsi="SimSun" w:eastAsia="SimSun"/>
+          <w:b w:val="0"/>
+          <w:i w:val="0"/>
+          <w:color w:val="000000"/>
+          <w:sz w:val="24"/>
+        </w:rPr>
+        <w:t>和</w:t>
+      </w:r>
+      <w:r>
+        <w:rPr>
+          <w:rFonts w:ascii="SimSun" w:hAnsi="SimSun" w:eastAsia="SimSun"/>
+          <w:b w:val="0"/>
+          <w:i/>
+          <w:color w:val="000000"/>
+          <w:sz w:val="24"/>
+        </w:rPr>
+        <w:t>斜体文字</w:t>
+      </w:r>
+      <w:r>
+        <w:rPr>
+          <w:rFonts w:ascii="SimSun" w:hAnsi="SimSun" w:eastAsia="SimSun"/>
+          <w:b w:val="0"/>
+          <w:i w:val="0"/>
+          <w:color w:val="000000"/>
+          <w:sz w:val="24"/>
+        </w:rPr>
+        <w:t>混排，以及</w:t>
+      </w:r>
       <w:r>
         <w:rPr>
           <w:rFonts w:ascii="Courier New" w:hAnsi="Courier New" w:eastAsia="SimSun"/>
           <w:b w:val="0"/>
           <w:i w:val="0"/>
-          <w:color w:val="374151"/>
+          <w:color w:val="000000"/>
           <w:sz w:val="20"/>
+          <w:shd w:val="clear" w:color="auto" w:fill="F5F7F9"/>
         </w:rPr>
-        <w:t>def hello():</w:t>
+        <w:t>行内代码</w:t>
+      </w:r>
+      <w:r>
+        <w:rPr>
+          <w:rFonts w:ascii="SimSun" w:hAnsi="SimSun" w:eastAsia="SimSun"/>
+          <w:b w:val="0"/>
+          <w:i w:val="0"/>
+          <w:color w:val="000000"/>
+          <w:sz w:val="24"/>
+        </w:rPr>
+        <w:t>和</w:t>
+      </w:r>
+      <w:hyperlink r:id="rId9">
+        <w:r>
+          <w:rPr>
+            <w:rFonts w:ascii="SimSun" w:hAnsi="SimSun" w:eastAsia="SimSun"/>
+            <w:b w:val="0"/>
+            <w:i w:val="0"/>
+            <w:color w:val="0000FF"/>
+            <w:sz w:val="24"/>
+            <w:u w:val="single"/>
+          </w:rPr>
+          <w:t>链接文本</w:t>
+        </w:r>
+      </w:hyperlink>
+      <w:r>
+        <w:rPr>
+          <w:rFonts w:ascii="SimSun" w:hAnsi="SimSun" w:eastAsia="SimSun"/>
+          <w:b w:val="0"/>
+          <w:i w:val="0"/>
+          <w:color w:val="000000"/>
+          <w:sz w:val="24"/>
+        </w:rPr>
+        <w:t>。还有</w:t>
+      </w:r>
+      <w:r>
+        <w:rPr>
+          <w:rFonts w:ascii="SimSun" w:hAnsi="SimSun" w:eastAsia="SimSun"/>
+          <w:b w:val="0"/>
+          <w:i w:val="0"/>
+          <w:color w:val="000000"/>
+          <w:sz w:val="24"/>
+          <w:u w:val="single"/>
+        </w:rPr>
+        <w:t>下划线文本</w:t>
+      </w:r>
+      <w:r>
+        <w:rPr>
+          <w:rFonts w:ascii="SimSun" w:hAnsi="SimSun" w:eastAsia="SimSun"/>
+          <w:b w:val="0"/>
+          <w:i w:val="0"/>
+          <w:color w:val="000000"/>
+          <w:sz w:val="24"/>
+        </w:rPr>
+        <w:t>和</w:t>
+      </w:r>
+      <w:r>
+        <w:rPr>
+          <w:rFonts w:ascii="SimSun" w:hAnsi="SimSun" w:eastAsia="SimSun"/>
+          <w:b w:val="0"/>
+          <w:i w:val="0"/>
+          <w:strike/>
+          <w:color w:val="000000"/>
+          <w:sz w:val="24"/>
+        </w:rPr>
+        <w:t>删除线文本</w:t>
+      </w:r>
+      <w:r>
+        <w:rPr>
+          <w:rFonts w:ascii="SimSun" w:hAnsi="SimSun" w:eastAsia="SimSun"/>
+          <w:b w:val="0"/>
+          <w:i w:val="0"/>
+          <w:color w:val="000000"/>
+          <w:sz w:val="24"/>
+        </w:rPr>
+        <w:t>。</w:t>
       </w:r>
     </w:p>
     <w:p>
       <w:pPr>
-        <w:spacing w:line="288" w:lineRule="auto" w:before="0" w:after="0"/>
-        <w:ind w:firstLine="0"/>
-        <w:jc w:val="left"/>
-      </w:pPr>
-      <w:r>
-        <w:rPr>
-          <w:rFonts w:ascii="Courier New" w:hAnsi="Courier New" w:eastAsia="SimSun"/>
-          <w:b w:val="0"/>
-          <w:i w:val="0"/>
-          <w:color w:val="374151"/>
-          <w:sz w:val="20"/>
-        </w:rPr>
-        <w:t xml:space="preserve">    print("你好，世界")</w:t>
-      </w:r>
-    </w:p>
-    <w:p/>
-    <w:p>
-      <w:pPr>
-        <w:spacing w:line="288" w:lineRule="auto" w:before="240" w:after="120"/>
-        <w:ind w:firstLine="0"/>
-        <w:jc w:val="left"/>
-      </w:pPr>
-      <w:r>
-        <w:rPr>
-          <w:rFonts w:ascii="SimSun" w:hAnsi="SimSun" w:eastAsia="SimSun"/>
-          <w:b/>
-          <w:i w:val="0"/>
-          <w:color w:val="1F2937"/>
-          <w:sz w:val="40"/>
-        </w:rPr>
-        <w:t>标题二：更多内容</w:t>
-      </w:r>
-    </w:p>
-    <w:p/>
-    <w:p>
-      <w:pPr>
-        <w:spacing w:line="384" w:lineRule="auto" w:before="0" w:after="160"/>
+        <w:spacing w:line="360" w:lineRule="auto" w:before="0" w:after="160"/>
         <w:ind w:firstLine="480"/>
         <w:jc w:val="left"/>
       </w:pPr>
@@ -197,10 +2141,498 @@
           <w:color w:val="000000"/>
           <w:sz w:val="24"/>
         </w:rPr>
-        <w:t>空行分隔之后的第二段正文。确保首行缩进与行距生效。</w:t>
+        <w:t>段落之间应该有适当的间距。中文标点，。！？和英文标点,.!?都需要正确显示。</w:t>
       </w:r>
     </w:p>
-    <w:p/>
+    <w:p>
+      <w:pPr>
+        <w:spacing w:before="120" w:after="120"/>
+        <w:pBdr>
+          <w:bottom w:val="single" w:sz="6" w:space="1" w:color="CCCCCC"/>
+        </w:pBdr>
+      </w:pPr>
+    </w:p>
+    <w:p>
+      <w:pPr>
+        <w:pStyle w:val="Heading2"/>
+        <w:spacing w:line="288" w:lineRule="auto" w:before="240" w:after="120"/>
+        <w:ind w:firstLine="0"/>
+        <w:jc w:val="left"/>
+      </w:pPr>
+      <w:r>
+        <w:rPr>
+          <w:rFonts w:ascii="SimSun" w:hAnsi="SimSun" w:eastAsia="SimSun"/>
+          <w:b/>
+          <w:i w:val="0"/>
+          <w:color w:val="000000"/>
+          <w:sz w:val="40"/>
+        </w:rPr>
+        <w:t>空行与间距测试</w:t>
+      </w:r>
+    </w:p>
+    <w:p>
+      <w:pPr>
+        <w:spacing w:line="360" w:lineRule="auto" w:before="0" w:after="160"/>
+        <w:ind w:firstLine="480"/>
+        <w:jc w:val="left"/>
+      </w:pPr>
+      <w:r>
+        <w:rPr>
+          <w:rFonts w:ascii="SimSun" w:hAnsi="SimSun" w:eastAsia="SimSun"/>
+          <w:b w:val="0"/>
+          <w:i w:val="0"/>
+          <w:color w:val="000000"/>
+          <w:sz w:val="24"/>
+        </w:rPr>
+        <w:t>上面有一个分隔线。</w:t>
+      </w:r>
+    </w:p>
+    <w:p>
+      <w:pPr>
+        <w:spacing w:line="360" w:lineRule="auto" w:before="0" w:after="160"/>
+        <w:ind w:firstLine="480"/>
+        <w:jc w:val="left"/>
+      </w:pPr>
+      <w:r>
+        <w:rPr>
+          <w:rFonts w:ascii="SimSun" w:hAnsi="SimSun" w:eastAsia="SimSun"/>
+          <w:b w:val="0"/>
+          <w:i w:val="0"/>
+          <w:color w:val="000000"/>
+          <w:sz w:val="24"/>
+        </w:rPr>
+        <w:t>这里是分隔线之后的内容。</w:t>
+      </w:r>
+    </w:p>
+    <w:p>
+      <w:pPr>
+        <w:spacing w:line="360" w:lineRule="auto" w:before="0" w:after="160"/>
+        <w:ind w:firstLine="480"/>
+        <w:jc w:val="left"/>
+      </w:pPr>
+      <w:r>
+        <w:rPr>
+          <w:rFonts w:ascii="SimSun" w:hAnsi="SimSun" w:eastAsia="SimSun"/>
+          <w:b w:val="0"/>
+          <w:i w:val="0"/>
+          <w:color w:val="000000"/>
+          <w:sz w:val="24"/>
+        </w:rPr>
+        <w:t>连续两个空行应该产生段落分隔效果。</w:t>
+      </w:r>
+    </w:p>
+    <w:p>
+      <w:pPr>
+        <w:spacing w:before="120" w:after="120"/>
+        <w:pBdr>
+          <w:bottom w:val="single" w:sz="6" w:space="1" w:color="CCCCCC"/>
+        </w:pBdr>
+      </w:pPr>
+    </w:p>
+    <w:p>
+      <w:pPr>
+        <w:pStyle w:val="Heading2"/>
+        <w:spacing w:line="288" w:lineRule="auto" w:before="240" w:after="120"/>
+        <w:ind w:firstLine="0"/>
+        <w:jc w:val="left"/>
+      </w:pPr>
+      <w:r>
+        <w:rPr>
+          <w:rFonts w:ascii="SimSun" w:hAnsi="SimSun" w:eastAsia="SimSun"/>
+          <w:b/>
+          <w:i w:val="0"/>
+          <w:color w:val="000000"/>
+          <w:sz w:val="40"/>
+        </w:rPr>
+        <w:t>边界情况</w:t>
+      </w:r>
+    </w:p>
+    <w:p>
+      <w:pPr>
+        <w:pStyle w:val="ListBullet"/>
+        <w:spacing w:line="360" w:lineRule="auto" w:before="0" w:after="160"/>
+        <w:ind w:firstLine="0"/>
+        <w:jc w:val="left"/>
+      </w:pPr>
+      <w:r>
+        <w:rPr>
+          <w:rFonts w:ascii="SimSun" w:hAnsi="SimSun" w:eastAsia="SimSun"/>
+          <w:b w:val="0"/>
+          <w:i w:val="0"/>
+          <w:color w:val="000000"/>
+          <w:sz w:val="24"/>
+        </w:rPr>
+        <w:t xml:space="preserve">列表项中包含 </w:t>
+      </w:r>
+      <w:r>
+        <w:rPr>
+          <w:rFonts w:ascii="SimSun" w:hAnsi="SimSun" w:eastAsia="SimSun"/>
+          <w:b/>
+          <w:i w:val="0"/>
+          <w:color w:val="000000"/>
+          <w:sz w:val="24"/>
+        </w:rPr>
+        <w:t>加粗</w:t>
+      </w:r>
+      <w:r>
+        <w:rPr>
+          <w:rFonts w:ascii="SimSun" w:hAnsi="SimSun" w:eastAsia="SimSun"/>
+          <w:b w:val="0"/>
+          <w:i w:val="0"/>
+          <w:color w:val="000000"/>
+          <w:sz w:val="24"/>
+        </w:rPr>
+        <w:t xml:space="preserve"> 和 </w:t>
+      </w:r>
+      <w:r>
+        <w:rPr>
+          <w:rFonts w:ascii="SimSun" w:hAnsi="SimSun" w:eastAsia="SimSun"/>
+          <w:b w:val="0"/>
+          <w:i/>
+          <w:color w:val="000000"/>
+          <w:sz w:val="24"/>
+        </w:rPr>
+        <w:t>斜体</w:t>
+      </w:r>
+    </w:p>
+    <w:p>
+      <w:pPr>
+        <w:pStyle w:val="ListBullet"/>
+        <w:spacing w:line="360" w:lineRule="auto" w:before="0" w:after="160"/>
+        <w:ind w:firstLine="0"/>
+        <w:jc w:val="left"/>
+      </w:pPr>
+      <w:r>
+        <w:rPr>
+          <w:rFonts w:ascii="SimSun" w:hAnsi="SimSun" w:eastAsia="SimSun"/>
+          <w:b w:val="0"/>
+          <w:i w:val="0"/>
+          <w:color w:val="000000"/>
+          <w:sz w:val="24"/>
+        </w:rPr>
+        <w:t xml:space="preserve">引用中包含 </w:t>
+      </w:r>
+      <w:r>
+        <w:rPr>
+          <w:rFonts w:ascii="Courier New" w:hAnsi="Courier New" w:eastAsia="SimSun"/>
+          <w:b w:val="0"/>
+          <w:i w:val="0"/>
+          <w:color w:val="000000"/>
+          <w:sz w:val="20"/>
+          <w:shd w:val="clear" w:color="auto" w:fill="F5F7F9"/>
+        </w:rPr>
+        <w:t>代码</w:t>
+      </w:r>
+      <w:r>
+        <w:rPr>
+          <w:rFonts w:ascii="SimSun" w:hAnsi="SimSun" w:eastAsia="SimSun"/>
+          <w:b w:val="0"/>
+          <w:i w:val="0"/>
+          <w:color w:val="000000"/>
+          <w:sz w:val="24"/>
+        </w:rPr>
+        <w:t xml:space="preserve"> 和 </w:t>
+      </w:r>
+      <w:hyperlink r:id="rId9">
+        <w:r>
+          <w:rPr>
+            <w:rFonts w:ascii="SimSun" w:hAnsi="SimSun" w:eastAsia="SimSun"/>
+            <w:b w:val="0"/>
+            <w:i w:val="0"/>
+            <w:color w:val="0000FF"/>
+            <w:sz w:val="24"/>
+            <w:u w:val="single"/>
+          </w:rPr>
+          <w:t>链接</w:t>
+        </w:r>
+      </w:hyperlink>
+    </w:p>
+    <w:p>
+      <w:pPr>
+        <w:pStyle w:val="ListBullet"/>
+        <w:spacing w:line="360" w:lineRule="auto" w:before="0" w:after="160"/>
+        <w:ind w:firstLine="0"/>
+        <w:jc w:val="left"/>
+      </w:pPr>
+      <w:r>
+        <w:rPr>
+          <w:rFonts w:ascii="SimSun" w:hAnsi="SimSun" w:eastAsia="SimSun"/>
+          <w:b w:val="0"/>
+          <w:i w:val="0"/>
+          <w:color w:val="000000"/>
+          <w:sz w:val="24"/>
+        </w:rPr>
+        <w:t xml:space="preserve">表格中包含 </w:t>
+      </w:r>
+      <w:r>
+        <w:rPr>
+          <w:rFonts w:ascii="Courier New" w:hAnsi="Courier New" w:eastAsia="SimSun"/>
+          <w:b w:val="0"/>
+          <w:i w:val="0"/>
+          <w:color w:val="000000"/>
+          <w:sz w:val="20"/>
+          <w:shd w:val="clear" w:color="auto" w:fill="F5F7F9"/>
+        </w:rPr>
+        <w:t>行内代码</w:t>
+      </w:r>
+      <w:r>
+        <w:rPr>
+          <w:rFonts w:ascii="SimSun" w:hAnsi="SimSun" w:eastAsia="SimSun"/>
+          <w:b w:val="0"/>
+          <w:i w:val="0"/>
+          <w:color w:val="000000"/>
+          <w:sz w:val="24"/>
+        </w:rPr>
+        <w:t xml:space="preserve"> 和 </w:t>
+      </w:r>
+      <w:r>
+        <w:rPr>
+          <w:rFonts w:ascii="SimSun" w:hAnsi="SimSun" w:eastAsia="SimSun"/>
+          <w:b/>
+          <w:i w:val="0"/>
+          <w:color w:val="000000"/>
+          <w:sz w:val="24"/>
+        </w:rPr>
+        <w:t>加粗</w:t>
+      </w:r>
+    </w:p>
+    <w:tbl>
+      <w:tblPr>
+        <w:tblW w:type="auto" w:w="0"/>
+        <w:jc w:val="center"/>
+        <w:tblLook w:firstColumn="1" w:firstRow="1" w:lastColumn="0" w:lastRow="0" w:noHBand="0" w:noVBand="1" w:val="04A0"/>
+      </w:tblPr>
+      <w:tblGrid>
+        <w:gridCol w:w="4680"/>
+        <w:gridCol w:w="4680"/>
+      </w:tblGrid>
+      <w:tr>
+        <w:tc>
+          <w:tcPr>
+            <w:tcW w:type="dxa" w:w="4680"/>
+            <w:tcBorders>
+              <w:top w:val="single" w:sz="4" w:color="000000"/>
+              <w:left w:val="single" w:sz="4" w:color="000000"/>
+              <w:bottom w:val="single" w:sz="4" w:color="000000"/>
+              <w:right w:val="single" w:sz="4" w:color="000000"/>
+            </w:tcBorders>
+            <w:vAlign w:val="center"/>
+            <w:shd w:fill="E5E7EB"/>
+          </w:tcPr>
+          <w:p>
+            <w:pPr>
+              <w:spacing w:line="360" w:lineRule="auto" w:before="0" w:after="160"/>
+              <w:ind w:firstLine="0"/>
+              <w:jc w:val="left"/>
+            </w:pPr>
+            <w:r>
+              <w:rPr>
+                <w:rFonts w:ascii="SimSun" w:hAnsi="SimSun" w:eastAsia="SimSun"/>
+                <w:b/>
+                <w:i w:val="0"/>
+                <w:color w:val="000000"/>
+                <w:sz w:val="24"/>
+              </w:rPr>
+              <w:t>混合格式</w:t>
+            </w:r>
+          </w:p>
+        </w:tc>
+        <w:tc>
+          <w:tcPr>
+            <w:tcW w:type="dxa" w:w="4680"/>
+            <w:tcBorders>
+              <w:top w:val="single" w:sz="4" w:color="000000"/>
+              <w:left w:val="single" w:sz="4" w:color="000000"/>
+              <w:bottom w:val="single" w:sz="4" w:color="000000"/>
+              <w:right w:val="single" w:sz="4" w:color="000000"/>
+            </w:tcBorders>
+            <w:vAlign w:val="center"/>
+            <w:shd w:fill="E5E7EB"/>
+          </w:tcPr>
+          <w:p>
+            <w:pPr>
+              <w:spacing w:line="360" w:lineRule="auto" w:before="0" w:after="160"/>
+              <w:ind w:firstLine="0"/>
+              <w:jc w:val="left"/>
+            </w:pPr>
+            <w:r>
+              <w:rPr>
+                <w:rFonts w:ascii="SimSun" w:hAnsi="SimSun" w:eastAsia="SimSun"/>
+                <w:b/>
+                <w:i w:val="0"/>
+                <w:color w:val="000000"/>
+                <w:sz w:val="24"/>
+              </w:rPr>
+              <w:t>示例</w:t>
+            </w:r>
+          </w:p>
+        </w:tc>
+      </w:tr>
+      <w:tr>
+        <w:tc>
+          <w:tcPr>
+            <w:tcW w:type="dxa" w:w="4680"/>
+            <w:tcBorders>
+              <w:top w:val="single" w:sz="4" w:color="000000"/>
+              <w:left w:val="single" w:sz="4" w:color="000000"/>
+              <w:bottom w:val="single" w:sz="4" w:color="000000"/>
+              <w:right w:val="single" w:sz="4" w:color="000000"/>
+            </w:tcBorders>
+            <w:vAlign w:val="center"/>
+          </w:tcPr>
+          <w:p>
+            <w:pPr>
+              <w:spacing w:line="360" w:lineRule="auto" w:before="0" w:after="160"/>
+              <w:ind w:firstLine="0"/>
+              <w:jc w:val="left"/>
+            </w:pPr>
+            <w:r>
+              <w:rPr>
+                <w:rFonts w:ascii="SimSun" w:hAnsi="SimSun" w:eastAsia="SimSun"/>
+                <w:b/>
+                <w:i w:val="0"/>
+                <w:color w:val="000000"/>
+                <w:sz w:val="24"/>
+              </w:rPr>
+              <w:t>加粗</w:t>
+            </w:r>
+            <w:r>
+              <w:rPr>
+                <w:rFonts w:ascii="SimSun" w:hAnsi="SimSun" w:eastAsia="SimSun"/>
+                <w:b w:val="0"/>
+                <w:i w:val="0"/>
+                <w:color w:val="000000"/>
+                <w:sz w:val="24"/>
+              </w:rPr>
+              <w:t xml:space="preserve"> + </w:t>
+            </w:r>
+            <w:r>
+              <w:rPr>
+                <w:rFonts w:ascii="SimSun" w:hAnsi="SimSun" w:eastAsia="SimSun"/>
+                <w:b w:val="0"/>
+                <w:i/>
+                <w:color w:val="000000"/>
+                <w:sz w:val="24"/>
+              </w:rPr>
+              <w:t>斜体</w:t>
+            </w:r>
+          </w:p>
+        </w:tc>
+        <w:tc>
+          <w:tcPr>
+            <w:tcW w:type="dxa" w:w="4680"/>
+            <w:tcBorders>
+              <w:top w:val="single" w:sz="4" w:color="000000"/>
+              <w:left w:val="single" w:sz="4" w:color="000000"/>
+              <w:bottom w:val="single" w:sz="4" w:color="000000"/>
+              <w:right w:val="single" w:sz="4" w:color="000000"/>
+            </w:tcBorders>
+            <w:vAlign w:val="center"/>
+          </w:tcPr>
+          <w:p>
+            <w:pPr>
+              <w:spacing w:line="360" w:lineRule="auto" w:before="0" w:after="160"/>
+              <w:ind w:firstLine="0"/>
+              <w:jc w:val="left"/>
+            </w:pPr>
+            <w:r>
+              <w:rPr>
+                <w:rFonts w:ascii="SimSun" w:hAnsi="SimSun" w:eastAsia="SimSun"/>
+                <w:b/>
+                <w:i/>
+                <w:color w:val="000000"/>
+                <w:sz w:val="24"/>
+              </w:rPr>
+              <w:t>粗斜体</w:t>
+            </w:r>
+          </w:p>
+        </w:tc>
+      </w:tr>
+      <w:tr>
+        <w:tc>
+          <w:tcPr>
+            <w:tcW w:type="dxa" w:w="4680"/>
+            <w:tcBorders>
+              <w:top w:val="single" w:sz="4" w:color="000000"/>
+              <w:left w:val="single" w:sz="4" w:color="000000"/>
+              <w:bottom w:val="single" w:sz="4" w:color="000000"/>
+              <w:right w:val="single" w:sz="4" w:color="000000"/>
+            </w:tcBorders>
+            <w:vAlign w:val="center"/>
+          </w:tcPr>
+          <w:p>
+            <w:pPr>
+              <w:spacing w:line="360" w:lineRule="auto" w:before="0" w:after="160"/>
+              <w:ind w:firstLine="0"/>
+              <w:jc w:val="left"/>
+            </w:pPr>
+            <w:r>
+              <w:rPr>
+                <w:rFonts w:ascii="Courier New" w:hAnsi="Courier New" w:eastAsia="SimSun"/>
+                <w:b w:val="0"/>
+                <w:i w:val="0"/>
+                <w:color w:val="000000"/>
+                <w:sz w:val="20"/>
+                <w:shd w:val="clear" w:color="auto" w:fill="F5F7F9"/>
+              </w:rPr>
+              <w:t>代码</w:t>
+            </w:r>
+            <w:r>
+              <w:rPr>
+                <w:rFonts w:ascii="SimSun" w:hAnsi="SimSun" w:eastAsia="SimSun"/>
+                <w:b w:val="0"/>
+                <w:i w:val="0"/>
+                <w:color w:val="000000"/>
+                <w:sz w:val="24"/>
+              </w:rPr>
+              <w:t xml:space="preserve"> + </w:t>
+            </w:r>
+            <w:hyperlink r:id="rId9">
+              <w:r>
+                <w:rPr>
+                  <w:rFonts w:ascii="SimSun" w:hAnsi="SimSun" w:eastAsia="SimSun"/>
+                  <w:b w:val="0"/>
+                  <w:i w:val="0"/>
+                  <w:color w:val="0000FF"/>
+                  <w:sz w:val="24"/>
+                  <w:u w:val="single"/>
+                </w:rPr>
+                <w:t>链接</w:t>
+              </w:r>
+            </w:hyperlink>
+          </w:p>
+        </w:tc>
+        <w:tc>
+          <w:tcPr>
+            <w:tcW w:type="dxa" w:w="4680"/>
+            <w:tcBorders>
+              <w:top w:val="single" w:sz="4" w:color="000000"/>
+              <w:left w:val="single" w:sz="4" w:color="000000"/>
+              <w:bottom w:val="single" w:sz="4" w:color="000000"/>
+              <w:right w:val="single" w:sz="4" w:color="000000"/>
+            </w:tcBorders>
+            <w:vAlign w:val="center"/>
+          </w:tcPr>
+          <w:p>
+            <w:pPr>
+              <w:spacing w:line="360" w:lineRule="auto" w:before="0" w:after="160"/>
+              <w:ind w:firstLine="0"/>
+              <w:jc w:val="left"/>
+            </w:pPr>
+            <w:r>
+              <w:rPr>
+                <w:rFonts w:ascii="SimSun" w:hAnsi="SimSun" w:eastAsia="SimSun"/>
+                <w:b w:val="0"/>
+                <w:i w:val="0"/>
+                <w:color w:val="000000"/>
+                <w:sz w:val="24"/>
+              </w:rPr>
+              <w:t>测试</w:t>
+            </w:r>
+          </w:p>
+        </w:tc>
+      </w:tr>
+    </w:tbl>
     <w:sectPr>
       <w:pgSz w:w="12240" w:h="15840"/>
       <w:pgMar w:top="1440" w:right="1440" w:bottom="1440" w:left="1440" w:header="720" w:footer="720" w:gutter="0"/>

</xml_diff>